<commit_message>
TS 3.1 3.2 Kramam corrections
</commit_message>
<xml_diff>
--- a/TS-Kramam/TS-3.1/TS 3.1 Tamil Krama Paatam Corrections.docx
+++ b/TS-Kramam/TS-3.1/TS 3.1 Tamil Krama Paatam Corrections.docx
@@ -1,7 +1,1588 @@
 
 <file path=word/document.xml><?xml version="1.0" encoding="utf-8"?>
-<w:document xmlns:wpc="http://schemas.microsoft.com/office/word/2010/wordprocessingCanvas" xmlns:cx="http://schemas.microsoft.com/office/drawing/2014/chartex" xmlns:cx1="http://schemas.microsoft.com/office/drawing/2015/9/8/chartex" xmlns:cx2="http://schemas.microsoft.com/office/drawing/2015/10/21/chartex" xmlns:cx3="http://schemas.microsoft.com/office/drawing/2016/5/9/chartex" xmlns:cx4="http://schemas.microsoft.com/office/drawing/2016/5/10/chartex" xmlns:cx5="http://schemas.microsoft.com/office/drawing/2016/5/11/chartex" xmlns:cx6="http://schemas.microsoft.com/office/drawing/2016/5/12/chartex" xmlns:cx7="http://schemas.microsoft.com/office/drawing/2016/5/13/chartex" xmlns:cx8="http://schemas.microsoft.com/office/drawing/2016/5/14/chartex" xmlns:mc="http://schemas.openxmlformats.org/markup-compatibility/2006" xmlns:aink="http://schemas.microsoft.com/office/drawing/2016/ink" xmlns:am3d="http://schemas.microsoft.com/office/drawing/2017/model3d" xmlns:o="urn:schemas-microsoft-com:office:office" xmlns:oel="http://schemas.microsoft.com/office/2019/extlst" xmlns:r="http://schemas.openxmlformats.org/officeDocument/2006/relationships" xmlns:m="http://schemas.openxmlformats.org/officeDocument/2006/math" xmlns:v="urn:schemas-microsoft-com:vml" xmlns:wp14="http://schemas.microsoft.com/office/word/2010/wordprocessingDrawing" xmlns:wp="http://schemas.openxmlformats.org/drawingml/2006/wordprocessingDrawing" xmlns:w10="urn:schemas-microsoft-com:office:word" xmlns:w="http://schemas.openxmlformats.org/wordprocessingml/2006/main" xmlns:w14="http://schemas.microsoft.com/office/word/2010/wordml" xmlns:w15="http://schemas.microsoft.com/office/word/2012/wordml" xmlns:w16cex="http://schemas.microsoft.com/office/word/2018/wordml/cex" xmlns:w16cid="http://schemas.microsoft.com/office/word/2016/wordml/cid" xmlns:w16="http://schemas.microsoft.com/office/word/2018/wordml" xmlns:w16sdtdh="http://schemas.microsoft.com/office/word/2020/wordml/sdtdatahash" xmlns:w16se="http://schemas.microsoft.com/office/word/2015/wordml/symex" xmlns:wpg="http://schemas.microsoft.com/office/word/2010/wordprocessingGroup" xmlns:wpi="http://schemas.microsoft.com/office/word/2010/wordprocessingInk" xmlns:wne="http://schemas.microsoft.com/office/word/2006/wordml" xmlns:wps="http://schemas.microsoft.com/office/word/2010/wordprocessingShape" mc:Ignorable="w14 w15 w16se w16cid w16 w16cex w16sdtdh wp14">
+<w:document xmlns:wpc="http://schemas.microsoft.com/office/word/2010/wordprocessingCanvas" xmlns:cx="http://schemas.microsoft.com/office/drawing/2014/chartex" xmlns:cx1="http://schemas.microsoft.com/office/drawing/2015/9/8/chartex" xmlns:cx2="http://schemas.microsoft.com/office/drawing/2015/10/21/chartex" xmlns:cx3="http://schemas.microsoft.com/office/drawing/2016/5/9/chartex" xmlns:cx4="http://schemas.microsoft.com/office/drawing/2016/5/10/chartex" xmlns:cx5="http://schemas.microsoft.com/office/drawing/2016/5/11/chartex" xmlns:cx6="http://schemas.microsoft.com/office/drawing/2016/5/12/chartex" xmlns:cx7="http://schemas.microsoft.com/office/drawing/2016/5/13/chartex" xmlns:cx8="http://schemas.microsoft.com/office/drawing/2016/5/14/chartex" xmlns:mc="http://schemas.openxmlformats.org/markup-compatibility/2006" xmlns:aink="http://schemas.microsoft.com/office/drawing/2016/ink" xmlns:am3d="http://schemas.microsoft.com/office/drawing/2017/model3d" xmlns:o="urn:schemas-microsoft-com:office:office" xmlns:oel="http://schemas.microsoft.com/office/2019/extlst" xmlns:r="http://schemas.openxmlformats.org/officeDocument/2006/relationships" xmlns:m="http://schemas.openxmlformats.org/officeDocument/2006/math" xmlns:v="urn:schemas-microsoft-com:vml" xmlns:wp14="http://schemas.microsoft.com/office/word/2010/wordprocessingDrawing" xmlns:wp="http://schemas.openxmlformats.org/drawingml/2006/wordprocessingDrawing" xmlns:w10="urn:schemas-microsoft-com:office:word" xmlns:w="http://schemas.openxmlformats.org/wordprocessingml/2006/main" xmlns:w14="http://schemas.microsoft.com/office/word/2010/wordml" xmlns:w15="http://schemas.microsoft.com/office/word/2012/wordml" xmlns:w16cex="http://schemas.microsoft.com/office/word/2018/wordml/cex" xmlns:w16cid="http://schemas.microsoft.com/office/word/2016/wordml/cid" xmlns:w16="http://schemas.microsoft.com/office/word/2018/wordml" xmlns:w16du="http://schemas.microsoft.com/office/word/2023/wordml/word16du" xmlns:w16sdtdh="http://schemas.microsoft.com/office/word/2020/wordml/sdtdatahash" xmlns:w16sdtfl="http://schemas.microsoft.com/office/word/2024/wordml/sdtformatlock" xmlns:w16se="http://schemas.microsoft.com/office/word/2015/wordml/symex" xmlns:wpg="http://schemas.microsoft.com/office/word/2010/wordprocessingGroup" xmlns:wpi="http://schemas.microsoft.com/office/word/2010/wordprocessingInk" xmlns:wne="http://schemas.microsoft.com/office/word/2006/wordml" xmlns:wps="http://schemas.microsoft.com/office/word/2010/wordprocessingShape" mc:Ignorable="w14 w15 w16se w16cid w16 w16cex w16sdtdh w16sdtfl w16du wp14">
   <w:body>
+    <w:p>
+      <w:pPr>
+        <w:jc w:val="center"/>
+        <w:rPr>
+          <w:b/>
+          <w:bCs/>
+          <w:sz w:val="32"/>
+          <w:szCs w:val="32"/>
+          <w:u w:val="single"/>
+        </w:rPr>
+      </w:pPr>
+      <w:r>
+        <w:rPr>
+          <w:b/>
+          <w:bCs/>
+          <w:sz w:val="32"/>
+          <w:szCs w:val="32"/>
+          <w:u w:val="single"/>
+        </w:rPr>
+        <w:t xml:space="preserve">TS </w:t>
+      </w:r>
+      <w:r>
+        <w:rPr>
+          <w:b/>
+          <w:bCs/>
+          <w:sz w:val="32"/>
+          <w:szCs w:val="32"/>
+          <w:u w:val="single"/>
+        </w:rPr>
+        <w:t>Krama</w:t>
+      </w:r>
+      <w:r>
+        <w:rPr>
+          <w:b/>
+          <w:bCs/>
+          <w:sz w:val="32"/>
+          <w:szCs w:val="32"/>
+          <w:u w:val="single"/>
+        </w:rPr>
+        <w:t xml:space="preserve"> Paatam – TS </w:t>
+      </w:r>
+      <w:r>
+        <w:rPr>
+          <w:b/>
+          <w:bCs/>
+          <w:sz w:val="32"/>
+          <w:szCs w:val="32"/>
+          <w:u w:val="single"/>
+        </w:rPr>
+        <w:t xml:space="preserve">3.1 </w:t>
+      </w:r>
+      <w:r>
+        <w:rPr>
+          <w:b/>
+          <w:bCs/>
+          <w:sz w:val="32"/>
+          <w:szCs w:val="32"/>
+          <w:u w:val="single"/>
+        </w:rPr>
+        <w:t>Tamil</w:t>
+      </w:r>
+      <w:r>
+        <w:rPr>
+          <w:b/>
+          <w:bCs/>
+          <w:sz w:val="32"/>
+          <w:szCs w:val="32"/>
+          <w:u w:val="single"/>
+        </w:rPr>
+        <w:t xml:space="preserve"> Corrections –Observed till </w:t>
+      </w:r>
+      <w:r>
+        <w:rPr>
+          <w:b/>
+          <w:bCs/>
+          <w:sz w:val="32"/>
+          <w:szCs w:val="32"/>
+          <w:highlight w:val="red"/>
+          <w:u w:val="single"/>
+        </w:rPr>
+        <w:t>?????</w:t>
+      </w:r>
+    </w:p>
+    <w:p>
+      <w:pPr>
+        <w:jc w:val="center"/>
+        <w:rPr>
+          <w:b/>
+          <w:bCs/>
+        </w:rPr>
+      </w:pPr>
+      <w:r>
+        <w:rPr>
+          <w:b/>
+          <w:bCs/>
+        </w:rPr>
+        <w:t>(ignore those which are already incorporated in your book’s version and date)</w:t>
+      </w:r>
+    </w:p>
+    <w:tbl>
+      <w:tblPr>
+        <w:tblW w:w="14395" w:type="dxa"/>
+        <w:tblInd w:w="-792" w:type="dxa"/>
+        <w:tblBorders>
+          <w:top w:val="single" w:sz="4" w:space="0" w:color="000000"/>
+          <w:left w:val="single" w:sz="4" w:space="0" w:color="000000"/>
+          <w:bottom w:val="single" w:sz="4" w:space="0" w:color="000000"/>
+          <w:right w:val="single" w:sz="4" w:space="0" w:color="000000"/>
+          <w:insideH w:val="single" w:sz="4" w:space="0" w:color="000000"/>
+          <w:insideV w:val="single" w:sz="4" w:space="0" w:color="000000"/>
+        </w:tblBorders>
+        <w:tblLook w:val="04A0" w:firstRow="1" w:lastRow="0" w:firstColumn="1" w:lastColumn="0" w:noHBand="0" w:noVBand="1"/>
+      </w:tblPr>
+      <w:tblGrid>
+        <w:gridCol w:w="3906"/>
+        <w:gridCol w:w="5103"/>
+        <w:gridCol w:w="5386"/>
+      </w:tblGrid>
+      <w:tr>
+        <w:tc>
+          <w:tcPr>
+            <w:tcW w:w="3906" w:type="dxa"/>
+          </w:tcPr>
+          <w:p>
+            <w:pPr>
+              <w:spacing w:before="0" w:line="240" w:lineRule="auto"/>
+              <w:jc w:val="center"/>
+              <w:rPr>
+                <w:b/>
+                <w:bCs/>
+                <w:sz w:val="32"/>
+                <w:szCs w:val="32"/>
+              </w:rPr>
+            </w:pPr>
+            <w:r>
+              <w:rPr>
+                <w:b/>
+                <w:bCs/>
+                <w:sz w:val="32"/>
+                <w:szCs w:val="32"/>
+              </w:rPr>
+              <w:t>Section, Paragraph</w:t>
+            </w:r>
+          </w:p>
+          <w:p>
+            <w:pPr>
+              <w:spacing w:before="0" w:line="240" w:lineRule="auto"/>
+              <w:jc w:val="center"/>
+              <w:rPr>
+                <w:b/>
+                <w:bCs/>
+                <w:sz w:val="32"/>
+                <w:szCs w:val="32"/>
+              </w:rPr>
+            </w:pPr>
+            <w:r>
+              <w:rPr>
+                <w:b/>
+                <w:bCs/>
+                <w:sz w:val="32"/>
+                <w:szCs w:val="32"/>
+              </w:rPr>
+              <w:t>Reference</w:t>
+            </w:r>
+          </w:p>
+        </w:tc>
+        <w:tc>
+          <w:tcPr>
+            <w:tcW w:w="5103" w:type="dxa"/>
+          </w:tcPr>
+          <w:p>
+            <w:pPr>
+              <w:spacing w:before="0" w:line="240" w:lineRule="auto"/>
+              <w:jc w:val="center"/>
+              <w:rPr>
+                <w:b/>
+                <w:bCs/>
+                <w:sz w:val="32"/>
+                <w:szCs w:val="32"/>
+              </w:rPr>
+            </w:pPr>
+            <w:r>
+              <w:rPr>
+                <w:b/>
+                <w:bCs/>
+                <w:sz w:val="32"/>
+                <w:szCs w:val="32"/>
+              </w:rPr>
+              <w:t>As Printed</w:t>
+            </w:r>
+          </w:p>
+        </w:tc>
+        <w:tc>
+          <w:tcPr>
+            <w:tcW w:w="5386" w:type="dxa"/>
+          </w:tcPr>
+          <w:p>
+            <w:pPr>
+              <w:spacing w:before="0" w:line="240" w:lineRule="auto"/>
+              <w:ind w:right="-18"/>
+              <w:jc w:val="center"/>
+              <w:rPr>
+                <w:b/>
+                <w:bCs/>
+                <w:sz w:val="32"/>
+                <w:szCs w:val="32"/>
+              </w:rPr>
+            </w:pPr>
+            <w:r>
+              <w:rPr>
+                <w:b/>
+                <w:bCs/>
+                <w:sz w:val="32"/>
+                <w:szCs w:val="32"/>
+              </w:rPr>
+              <w:t>To be read as or corrected as</w:t>
+            </w:r>
+          </w:p>
+        </w:tc>
+      </w:tr>
+      <w:tr>
+        <w:trPr>
+          <w:trHeight w:val="1814"/>
+        </w:trPr>
+        <w:tc>
+          <w:tcPr>
+            <w:tcW w:w="3906" w:type="dxa"/>
+          </w:tcPr>
+          <w:p>
+            <w:pPr>
+              <w:widowControl w:val="0"/>
+              <w:tabs>
+                <w:tab w:val="left" w:pos="993"/>
+              </w:tabs>
+              <w:autoSpaceDE w:val="0"/>
+              <w:autoSpaceDN w:val="0"/>
+              <w:adjustRightInd w:val="0"/>
+              <w:spacing w:before="0" w:line="240" w:lineRule="auto"/>
+              <w:ind w:right="297"/>
+              <w:rPr>
+                <w:rFonts w:cs="Arial"/>
+                <w:b/>
+                <w:color w:val="000000" w:themeColor="text1"/>
+                <w:sz w:val="28"/>
+                <w:szCs w:val="32"/>
+              </w:rPr>
+            </w:pPr>
+            <w:r>
+              <w:rPr>
+                <w:rFonts w:cs="Arial"/>
+                <w:b/>
+                <w:color w:val="000000" w:themeColor="text1"/>
+                <w:sz w:val="28"/>
+                <w:szCs w:val="32"/>
+              </w:rPr>
+              <w:t>T.S.3.1.</w:t>
+            </w:r>
+            <w:r>
+              <w:rPr>
+                <w:rFonts w:cs="Arial"/>
+                <w:b/>
+                <w:color w:val="000000" w:themeColor="text1"/>
+                <w:sz w:val="28"/>
+                <w:szCs w:val="32"/>
+              </w:rPr>
+              <w:t>9.6</w:t>
+            </w:r>
+            <w:r>
+              <w:rPr>
+                <w:rFonts w:cs="Arial"/>
+                <w:b/>
+                <w:color w:val="000000" w:themeColor="text1"/>
+                <w:sz w:val="28"/>
+                <w:szCs w:val="32"/>
+              </w:rPr>
+              <w:t xml:space="preserve"> – Kramam</w:t>
+            </w:r>
+          </w:p>
+          <w:p>
+            <w:pPr>
+              <w:widowControl w:val="0"/>
+              <w:tabs>
+                <w:tab w:val="left" w:pos="993"/>
+              </w:tabs>
+              <w:autoSpaceDE w:val="0"/>
+              <w:autoSpaceDN w:val="0"/>
+              <w:adjustRightInd w:val="0"/>
+              <w:spacing w:before="0" w:line="240" w:lineRule="auto"/>
+              <w:ind w:right="297"/>
+              <w:rPr>
+                <w:rFonts w:cs="Arial"/>
+                <w:b/>
+                <w:color w:val="000000" w:themeColor="text1"/>
+                <w:szCs w:val="32"/>
+              </w:rPr>
+            </w:pPr>
+            <w:r>
+              <w:rPr>
+                <w:rFonts w:cs="Arial"/>
+                <w:b/>
+                <w:color w:val="000000" w:themeColor="text1"/>
+                <w:sz w:val="28"/>
+                <w:szCs w:val="32"/>
+              </w:rPr>
+              <w:t>Krama Vaakyam</w:t>
+            </w:r>
+            <w:r>
+              <w:rPr>
+                <w:rFonts w:cs="Arial"/>
+                <w:b/>
+                <w:color w:val="000000" w:themeColor="text1"/>
+                <w:szCs w:val="32"/>
+              </w:rPr>
+              <w:t xml:space="preserve"> No.– </w:t>
+            </w:r>
+            <w:r>
+              <w:rPr>
+                <w:rFonts w:cs="Arial"/>
+                <w:b/>
+                <w:color w:val="000000" w:themeColor="text1"/>
+                <w:szCs w:val="32"/>
+              </w:rPr>
+              <w:t>59</w:t>
+            </w:r>
+            <w:r>
+              <w:rPr>
+                <w:rFonts w:cs="Arial"/>
+                <w:b/>
+                <w:color w:val="000000" w:themeColor="text1"/>
+                <w:szCs w:val="32"/>
+              </w:rPr>
+              <w:t xml:space="preserve"> </w:t>
+            </w:r>
+          </w:p>
+          <w:p>
+            <w:pPr>
+              <w:widowControl w:val="0"/>
+              <w:tabs>
+                <w:tab w:val="left" w:pos="993"/>
+              </w:tabs>
+              <w:autoSpaceDE w:val="0"/>
+              <w:autoSpaceDN w:val="0"/>
+              <w:adjustRightInd w:val="0"/>
+              <w:spacing w:before="0" w:line="240" w:lineRule="auto"/>
+              <w:ind w:right="297"/>
+              <w:rPr>
+                <w:rFonts w:cs="Arial"/>
+                <w:b/>
+                <w:color w:val="000000" w:themeColor="text1"/>
+                <w:sz w:val="28"/>
+                <w:szCs w:val="32"/>
+              </w:rPr>
+            </w:pPr>
+            <w:r>
+              <w:rPr>
+                <w:rFonts w:cs="Arial"/>
+                <w:b/>
+                <w:color w:val="000000" w:themeColor="text1"/>
+                <w:sz w:val="28"/>
+                <w:szCs w:val="32"/>
+              </w:rPr>
+              <w:t>Panchaati No</w:t>
+            </w:r>
+            <w:r>
+              <w:rPr>
+                <w:rFonts w:cs="Arial"/>
+                <w:b/>
+                <w:color w:val="000000" w:themeColor="text1"/>
+                <w:szCs w:val="32"/>
+              </w:rPr>
+              <w:t xml:space="preserve">. - </w:t>
+            </w:r>
+            <w:r>
+              <w:rPr>
+                <w:rFonts w:cs="Arial"/>
+                <w:b/>
+                <w:color w:val="000000" w:themeColor="text1"/>
+                <w:szCs w:val="32"/>
+              </w:rPr>
+              <w:t>31</w:t>
+            </w:r>
+          </w:p>
+        </w:tc>
+        <w:tc>
+          <w:tcPr>
+            <w:tcW w:w="5103" w:type="dxa"/>
+          </w:tcPr>
+          <w:p>
+            <w:pPr>
+              <w:widowControl w:val="0"/>
+              <w:autoSpaceDE w:val="0"/>
+              <w:autoSpaceDN w:val="0"/>
+              <w:adjustRightInd w:val="0"/>
+              <w:spacing w:before="0" w:line="240" w:lineRule="auto"/>
+              <w:rPr>
+                <w:rFonts w:ascii="BRH Devanagari Extra" w:hAnsi="BRH Devanagari Extra" w:cs="BRH Devanagari Extra"/>
+                <w:color w:val="000000"/>
+                <w:sz w:val="40"/>
+                <w:szCs w:val="40"/>
+              </w:rPr>
+            </w:pPr>
+            <w:r>
+              <w:rPr>
+                <w:rFonts w:ascii="Latha" w:hAnsi="Latha" w:cs="Latha"/>
+                <w:sz w:val="28"/>
+                <w:szCs w:val="28"/>
+                <w:cs/>
+                <w:lang w:bidi="ta-IN"/>
+              </w:rPr>
+              <w:t>ஸ</w:t>
+            </w:r>
+            <w:r>
+              <w:rPr>
+                <w:rFonts w:ascii="BRH Tamil Tab Extra" w:hAnsi="BRH Tamil Tab Extra" w:cs="Latha"/>
+                <w:b/>
+                <w:sz w:val="32"/>
+                <w:szCs w:val="28"/>
+                <w:lang w:bidi="ta-IN"/>
+              </w:rPr>
+              <w:t>…</w:t>
+            </w:r>
+            <w:r>
+              <w:rPr>
+                <w:rFonts w:ascii="BRH Devanagari Extra" w:hAnsi="BRH Devanagari Extra" w:cs="Latha"/>
+                <w:b/>
+                <w:sz w:val="36"/>
+                <w:szCs w:val="28"/>
+                <w:lang w:bidi="ta-IN"/>
+              </w:rPr>
+              <w:t>ò</w:t>
+            </w:r>
+            <w:r>
+              <w:rPr>
+                <w:rFonts w:ascii="BRH Tamil Tab Extra" w:hAnsi="BRH Tamil Tab Extra" w:cs="Latha"/>
+                <w:b/>
+                <w:sz w:val="32"/>
+                <w:szCs w:val="28"/>
+                <w:lang w:bidi="ta-IN"/>
+              </w:rPr>
+              <w:t>…</w:t>
+            </w:r>
+            <w:r>
+              <w:rPr>
+                <w:rFonts w:ascii="Latha" w:hAnsi="Latha" w:cs="Latha"/>
+                <w:sz w:val="28"/>
+                <w:szCs w:val="28"/>
+                <w:cs/>
+                <w:lang w:bidi="ta-IN"/>
+              </w:rPr>
+              <w:t>ஸ்ரா</w:t>
+            </w:r>
+            <w:r>
+              <w:rPr>
+                <w:rFonts w:ascii="BRH Tamil Tab Extra" w:hAnsi="BRH Tamil Tab Extra" w:cs="Latha"/>
+                <w:b/>
+                <w:sz w:val="32"/>
+                <w:szCs w:val="28"/>
+                <w:lang w:bidi="ta-IN"/>
+              </w:rPr>
+              <w:t>…</w:t>
+            </w:r>
+            <w:r>
+              <w:rPr>
+                <w:rFonts w:ascii="Latha" w:hAnsi="Latha" w:cs="Latha"/>
+                <w:sz w:val="28"/>
+                <w:szCs w:val="28"/>
+                <w:cs/>
+                <w:lang w:bidi="ta-IN"/>
+              </w:rPr>
+              <w:t>வஞ் ஜு</w:t>
+            </w:r>
+            <w:r>
+              <w:rPr>
+                <w:rFonts w:ascii="BRH Tamil Tab Extra" w:hAnsi="BRH Tamil Tab Extra" w:cs="Latha"/>
+                <w:b/>
+                <w:sz w:val="32"/>
+                <w:szCs w:val="28"/>
+                <w:lang w:bidi="ta-IN"/>
+              </w:rPr>
+              <w:t>…</w:t>
+            </w:r>
+            <w:r>
+              <w:rPr>
+                <w:rFonts w:ascii="Latha" w:hAnsi="Latha" w:cs="Latha"/>
+                <w:sz w:val="28"/>
+                <w:szCs w:val="28"/>
+                <w:cs/>
+                <w:lang w:bidi="ta-IN"/>
+              </w:rPr>
+              <w:t>ஹோதி</w:t>
+            </w:r>
+            <w:r>
+              <w:rPr>
+                <w:rFonts w:ascii="BRH Tamil Tab Extra" w:hAnsi="BRH Tamil Tab Extra" w:cs="Latha"/>
+                <w:b/>
+                <w:sz w:val="36"/>
+                <w:szCs w:val="28"/>
+                <w:lang w:bidi="ta-IN"/>
+              </w:rPr>
+              <w:t>†</w:t>
+            </w:r>
+            <w:r>
+              <w:rPr>
+                <w:rFonts w:ascii="Latha" w:hAnsi="Latha" w:cs="Latha"/>
+                <w:sz w:val="28"/>
+                <w:szCs w:val="28"/>
+                <w:lang w:bidi="ta-IN"/>
+              </w:rPr>
+              <w:t xml:space="preserve"> | </w:t>
+            </w:r>
+            <w:r>
+              <w:rPr>
+                <w:rFonts w:ascii="Latha" w:hAnsi="Latha" w:cs="Latha"/>
+                <w:sz w:val="28"/>
+                <w:szCs w:val="28"/>
+                <w:highlight w:val="yellow"/>
+                <w:cs/>
+                <w:lang w:bidi="ta-IN"/>
+              </w:rPr>
+              <w:t>ஸ</w:t>
+            </w:r>
+            <w:r>
+              <w:rPr>
+                <w:rFonts w:ascii="BRH Tamil Tab Extra" w:hAnsi="BRH Tamil Tab Extra" w:cs="Latha"/>
+                <w:b/>
+                <w:sz w:val="32"/>
+                <w:szCs w:val="28"/>
+                <w:highlight w:val="yellow"/>
+                <w:lang w:bidi="ta-IN"/>
+              </w:rPr>
+              <w:t>…</w:t>
+            </w:r>
+            <w:r>
+              <w:rPr>
+                <w:rFonts w:ascii="BRH Devanagari Extra" w:hAnsi="BRH Devanagari Extra" w:cs="Latha"/>
+                <w:b/>
+                <w:sz w:val="36"/>
+                <w:szCs w:val="28"/>
+                <w:highlight w:val="yellow"/>
+                <w:lang w:bidi="ta-IN"/>
+              </w:rPr>
+              <w:t>ó</w:t>
+            </w:r>
+            <w:r>
+              <w:rPr>
+                <w:rFonts w:ascii="BRH Devanagari Extra" w:hAnsi="BRH Devanagari Extra" w:cs="Latha"/>
+                <w:b/>
+                <w:sz w:val="36"/>
+                <w:szCs w:val="28"/>
+                <w:highlight w:val="yellow"/>
+                <w:lang w:bidi="ta-IN"/>
+              </w:rPr>
+              <w:t>è</w:t>
+            </w:r>
+            <w:r>
+              <w:rPr>
+                <w:rFonts w:ascii="BRH Tamil Tab Extra" w:hAnsi="BRH Tamil Tab Extra" w:cs="Latha"/>
+                <w:b/>
+                <w:sz w:val="32"/>
+                <w:szCs w:val="28"/>
+                <w:highlight w:val="yellow"/>
+                <w:lang w:bidi="ta-IN"/>
+              </w:rPr>
+              <w:t>…</w:t>
+            </w:r>
+            <w:r>
+              <w:rPr>
+                <w:rFonts w:ascii="Latha" w:hAnsi="Latha" w:cs="Latha"/>
+                <w:sz w:val="28"/>
+                <w:szCs w:val="28"/>
+                <w:cs/>
+                <w:lang w:bidi="ta-IN"/>
+              </w:rPr>
+              <w:t>ஸ்</w:t>
+            </w:r>
+            <w:r>
+              <w:rPr>
+                <w:rFonts w:ascii="Latha" w:hAnsi="Latha" w:cs="Latha"/>
+                <w:sz w:val="28"/>
+                <w:szCs w:val="28"/>
+                <w:cs/>
+                <w:lang w:bidi="ta-IN"/>
+              </w:rPr>
+              <w:t>ரா</w:t>
+            </w:r>
+            <w:r>
+              <w:rPr>
+                <w:rFonts w:ascii="BRH Tamil Tab Extra" w:hAnsi="BRH Tamil Tab Extra" w:cs="Latha"/>
+                <w:b/>
+                <w:sz w:val="32"/>
+                <w:szCs w:val="28"/>
+                <w:lang w:bidi="ta-IN"/>
+              </w:rPr>
+              <w:t>…</w:t>
+            </w:r>
+            <w:r>
+              <w:rPr>
+                <w:rFonts w:ascii="Latha" w:hAnsi="Latha" w:cs="Latha"/>
+                <w:sz w:val="28"/>
+                <w:szCs w:val="28"/>
+                <w:cs/>
+                <w:lang w:bidi="ta-IN"/>
+              </w:rPr>
+              <w:t>வமிதி</w:t>
+            </w:r>
+            <w:r>
+              <w:rPr>
+                <w:rFonts w:ascii="BRH Tamil Tab Extra" w:hAnsi="BRH Tamil Tab Extra" w:cs="Latha"/>
+                <w:b/>
+                <w:sz w:val="36"/>
+                <w:szCs w:val="28"/>
+                <w:lang w:bidi="ta-IN"/>
+              </w:rPr>
+              <w:t>†</w:t>
+            </w:r>
+            <w:r>
+              <w:rPr>
+                <w:rFonts w:ascii="Latha" w:hAnsi="Latha" w:cs="Latha"/>
+                <w:sz w:val="28"/>
+                <w:szCs w:val="28"/>
+                <w:lang w:bidi="ta-IN"/>
+              </w:rPr>
+              <w:t xml:space="preserve"> </w:t>
+            </w:r>
+            <w:r>
+              <w:rPr>
+                <w:rFonts w:ascii="Latha" w:hAnsi="Latha" w:cs="Latha"/>
+                <w:sz w:val="28"/>
+                <w:szCs w:val="28"/>
+                <w:cs/>
+                <w:lang w:bidi="ta-IN"/>
+              </w:rPr>
+              <w:t xml:space="preserve">ஸம் </w:t>
+            </w:r>
+            <w:r>
+              <w:rPr>
+                <w:rFonts w:ascii="Latha" w:hAnsi="Latha" w:cs="Latha"/>
+                <w:sz w:val="28"/>
+                <w:szCs w:val="28"/>
+                <w:lang w:bidi="ta-IN"/>
+              </w:rPr>
+              <w:t xml:space="preserve">- </w:t>
+            </w:r>
+            <w:r>
+              <w:rPr>
+                <w:rFonts w:ascii="Latha" w:hAnsi="Latha" w:cs="Latha"/>
+                <w:sz w:val="28"/>
+                <w:szCs w:val="28"/>
+                <w:cs/>
+                <w:lang w:bidi="ta-IN"/>
+              </w:rPr>
+              <w:t>ஸ்ரா</w:t>
+            </w:r>
+            <w:r>
+              <w:rPr>
+                <w:rFonts w:ascii="BRH Tamil Tab Extra" w:hAnsi="BRH Tamil Tab Extra" w:cs="Latha"/>
+                <w:b/>
+                <w:sz w:val="32"/>
+                <w:szCs w:val="28"/>
+                <w:lang w:bidi="ta-IN"/>
+              </w:rPr>
+              <w:t>…</w:t>
+            </w:r>
+            <w:r>
+              <w:rPr>
+                <w:rFonts w:ascii="Latha" w:hAnsi="Latha" w:cs="Latha"/>
+                <w:sz w:val="28"/>
+                <w:szCs w:val="28"/>
+                <w:cs/>
+                <w:lang w:bidi="ta-IN"/>
+              </w:rPr>
+              <w:t xml:space="preserve">வம் </w:t>
+            </w:r>
+            <w:r>
+              <w:rPr>
+                <w:rFonts w:ascii="Latha" w:hAnsi="Latha" w:cs="Latha"/>
+                <w:sz w:val="28"/>
+                <w:szCs w:val="28"/>
+                <w:lang w:bidi="ta-IN"/>
+              </w:rPr>
+              <w:t>|</w:t>
+            </w:r>
+          </w:p>
+        </w:tc>
+        <w:tc>
+          <w:tcPr>
+            <w:tcW w:w="5386" w:type="dxa"/>
+          </w:tcPr>
+          <w:p>
+            <w:pPr>
+              <w:widowControl w:val="0"/>
+              <w:autoSpaceDE w:val="0"/>
+              <w:autoSpaceDN w:val="0"/>
+              <w:adjustRightInd w:val="0"/>
+              <w:spacing w:before="0" w:line="240" w:lineRule="auto"/>
+              <w:rPr>
+                <w:rFonts w:ascii="BRH Devanagari Extra" w:hAnsi="BRH Devanagari Extra" w:cs="BRH Devanagari Extra"/>
+                <w:color w:val="000000"/>
+                <w:sz w:val="40"/>
+                <w:szCs w:val="40"/>
+              </w:rPr>
+            </w:pPr>
+            <w:r>
+              <w:rPr>
+                <w:rFonts w:ascii="Latha" w:hAnsi="Latha" w:cs="Latha"/>
+                <w:sz w:val="28"/>
+                <w:szCs w:val="28"/>
+                <w:cs/>
+                <w:lang w:bidi="ta-IN"/>
+              </w:rPr>
+              <w:t>ஸ</w:t>
+            </w:r>
+            <w:r>
+              <w:rPr>
+                <w:rFonts w:ascii="BRH Tamil Tab Extra" w:hAnsi="BRH Tamil Tab Extra" w:cs="Latha"/>
+                <w:b/>
+                <w:sz w:val="32"/>
+                <w:szCs w:val="28"/>
+                <w:lang w:bidi="ta-IN"/>
+              </w:rPr>
+              <w:t>…</w:t>
+            </w:r>
+            <w:r>
+              <w:rPr>
+                <w:rFonts w:ascii="BRH Devanagari Extra" w:hAnsi="BRH Devanagari Extra" w:cs="Latha"/>
+                <w:b/>
+                <w:sz w:val="36"/>
+                <w:szCs w:val="28"/>
+                <w:lang w:bidi="ta-IN"/>
+              </w:rPr>
+              <w:t>ò</w:t>
+            </w:r>
+            <w:r>
+              <w:rPr>
+                <w:rFonts w:ascii="BRH Tamil Tab Extra" w:hAnsi="BRH Tamil Tab Extra" w:cs="Latha"/>
+                <w:b/>
+                <w:sz w:val="32"/>
+                <w:szCs w:val="28"/>
+                <w:lang w:bidi="ta-IN"/>
+              </w:rPr>
+              <w:t>…</w:t>
+            </w:r>
+            <w:r>
+              <w:rPr>
+                <w:rFonts w:ascii="Latha" w:hAnsi="Latha" w:cs="Latha"/>
+                <w:sz w:val="28"/>
+                <w:szCs w:val="28"/>
+                <w:cs/>
+                <w:lang w:bidi="ta-IN"/>
+              </w:rPr>
+              <w:t>ஸ்ரா</w:t>
+            </w:r>
+            <w:r>
+              <w:rPr>
+                <w:rFonts w:ascii="BRH Tamil Tab Extra" w:hAnsi="BRH Tamil Tab Extra" w:cs="Latha"/>
+                <w:b/>
+                <w:sz w:val="32"/>
+                <w:szCs w:val="28"/>
+                <w:lang w:bidi="ta-IN"/>
+              </w:rPr>
+              <w:t>…</w:t>
+            </w:r>
+            <w:r>
+              <w:rPr>
+                <w:rFonts w:ascii="Latha" w:hAnsi="Latha" w:cs="Latha"/>
+                <w:sz w:val="28"/>
+                <w:szCs w:val="28"/>
+                <w:cs/>
+                <w:lang w:bidi="ta-IN"/>
+              </w:rPr>
+              <w:t>வஞ் ஜு</w:t>
+            </w:r>
+            <w:r>
+              <w:rPr>
+                <w:rFonts w:ascii="BRH Tamil Tab Extra" w:hAnsi="BRH Tamil Tab Extra" w:cs="Latha"/>
+                <w:b/>
+                <w:sz w:val="32"/>
+                <w:szCs w:val="28"/>
+                <w:lang w:bidi="ta-IN"/>
+              </w:rPr>
+              <w:t>…</w:t>
+            </w:r>
+            <w:r>
+              <w:rPr>
+                <w:rFonts w:ascii="Latha" w:hAnsi="Latha" w:cs="Latha"/>
+                <w:sz w:val="28"/>
+                <w:szCs w:val="28"/>
+                <w:cs/>
+                <w:lang w:bidi="ta-IN"/>
+              </w:rPr>
+              <w:t>ஹோதி</w:t>
+            </w:r>
+            <w:r>
+              <w:rPr>
+                <w:rFonts w:ascii="BRH Tamil Tab Extra" w:hAnsi="BRH Tamil Tab Extra" w:cs="Latha"/>
+                <w:b/>
+                <w:sz w:val="36"/>
+                <w:szCs w:val="28"/>
+                <w:lang w:bidi="ta-IN"/>
+              </w:rPr>
+              <w:t>†</w:t>
+            </w:r>
+            <w:r>
+              <w:rPr>
+                <w:rFonts w:ascii="Latha" w:hAnsi="Latha" w:cs="Latha"/>
+                <w:sz w:val="28"/>
+                <w:szCs w:val="28"/>
+                <w:lang w:bidi="ta-IN"/>
+              </w:rPr>
+              <w:t xml:space="preserve"> | </w:t>
+            </w:r>
+            <w:r>
+              <w:rPr>
+                <w:rFonts w:ascii="Latha" w:hAnsi="Latha" w:cs="Latha"/>
+                <w:sz w:val="28"/>
+                <w:szCs w:val="28"/>
+                <w:lang w:bidi="ta-IN"/>
+              </w:rPr>
+              <w:br/>
+            </w:r>
+            <w:r>
+              <w:rPr>
+                <w:rFonts w:ascii="Latha" w:hAnsi="Latha" w:cs="Latha"/>
+                <w:sz w:val="28"/>
+                <w:szCs w:val="28"/>
+                <w:highlight w:val="green"/>
+                <w:cs/>
+                <w:lang w:bidi="ta-IN"/>
+              </w:rPr>
+              <w:t>ஸ</w:t>
+            </w:r>
+            <w:r>
+              <w:rPr>
+                <w:rFonts w:ascii="BRH Tamil Tab Extra" w:hAnsi="BRH Tamil Tab Extra" w:cs="Latha"/>
+                <w:b/>
+                <w:sz w:val="32"/>
+                <w:szCs w:val="28"/>
+                <w:highlight w:val="green"/>
+                <w:lang w:bidi="ta-IN"/>
+              </w:rPr>
+              <w:t>…</w:t>
+            </w:r>
+            <w:r>
+              <w:rPr>
+                <w:rFonts w:ascii="BRH Devanagari Extra" w:hAnsi="BRH Devanagari Extra" w:cs="Latha"/>
+                <w:b/>
+                <w:sz w:val="36"/>
+                <w:szCs w:val="28"/>
+                <w:highlight w:val="green"/>
+                <w:lang w:bidi="ta-IN"/>
+              </w:rPr>
+              <w:t>ò</w:t>
+            </w:r>
+            <w:r>
+              <w:rPr>
+                <w:rFonts w:ascii="BRH Tamil Tab Extra" w:hAnsi="BRH Tamil Tab Extra" w:cs="Latha"/>
+                <w:b/>
+                <w:sz w:val="32"/>
+                <w:szCs w:val="28"/>
+                <w:lang w:bidi="ta-IN"/>
+              </w:rPr>
+              <w:t>…</w:t>
+            </w:r>
+            <w:r>
+              <w:rPr>
+                <w:rFonts w:ascii="BRH Tamil Tab Extra" w:hAnsi="BRH Tamil Tab Extra" w:cs="Latha"/>
+                <w:b/>
+                <w:sz w:val="32"/>
+                <w:szCs w:val="28"/>
+                <w:highlight w:val="yellow"/>
+                <w:lang w:bidi="ta-IN"/>
+              </w:rPr>
+              <w:t>…</w:t>
+            </w:r>
+            <w:r>
+              <w:rPr>
+                <w:rFonts w:ascii="Latha" w:hAnsi="Latha" w:cs="Latha"/>
+                <w:sz w:val="28"/>
+                <w:szCs w:val="28"/>
+                <w:cs/>
+                <w:lang w:bidi="ta-IN"/>
+              </w:rPr>
+              <w:t>ஸ்ரா</w:t>
+            </w:r>
+            <w:r>
+              <w:rPr>
+                <w:rFonts w:ascii="BRH Tamil Tab Extra" w:hAnsi="BRH Tamil Tab Extra" w:cs="Latha"/>
+                <w:b/>
+                <w:sz w:val="32"/>
+                <w:szCs w:val="28"/>
+                <w:lang w:bidi="ta-IN"/>
+              </w:rPr>
+              <w:t>…</w:t>
+            </w:r>
+            <w:r>
+              <w:rPr>
+                <w:rFonts w:ascii="Latha" w:hAnsi="Latha" w:cs="Latha"/>
+                <w:sz w:val="28"/>
+                <w:szCs w:val="28"/>
+                <w:cs/>
+                <w:lang w:bidi="ta-IN"/>
+              </w:rPr>
+              <w:t>வமிதி</w:t>
+            </w:r>
+            <w:r>
+              <w:rPr>
+                <w:rFonts w:ascii="BRH Tamil Tab Extra" w:hAnsi="BRH Tamil Tab Extra" w:cs="Latha"/>
+                <w:b/>
+                <w:sz w:val="36"/>
+                <w:szCs w:val="28"/>
+                <w:lang w:bidi="ta-IN"/>
+              </w:rPr>
+              <w:t>†</w:t>
+            </w:r>
+            <w:r>
+              <w:rPr>
+                <w:rFonts w:ascii="Latha" w:hAnsi="Latha" w:cs="Latha"/>
+                <w:sz w:val="28"/>
+                <w:szCs w:val="28"/>
+                <w:lang w:bidi="ta-IN"/>
+              </w:rPr>
+              <w:t xml:space="preserve"> </w:t>
+            </w:r>
+            <w:r>
+              <w:rPr>
+                <w:rFonts w:ascii="Latha" w:hAnsi="Latha" w:cs="Latha"/>
+                <w:sz w:val="28"/>
+                <w:szCs w:val="28"/>
+                <w:cs/>
+                <w:lang w:bidi="ta-IN"/>
+              </w:rPr>
+              <w:t xml:space="preserve">ஸம் </w:t>
+            </w:r>
+            <w:r>
+              <w:rPr>
+                <w:rFonts w:ascii="Latha" w:hAnsi="Latha" w:cs="Latha"/>
+                <w:sz w:val="28"/>
+                <w:szCs w:val="28"/>
+                <w:lang w:bidi="ta-IN"/>
+              </w:rPr>
+              <w:t xml:space="preserve">- </w:t>
+            </w:r>
+            <w:r>
+              <w:rPr>
+                <w:rFonts w:ascii="Latha" w:hAnsi="Latha" w:cs="Latha"/>
+                <w:sz w:val="28"/>
+                <w:szCs w:val="28"/>
+                <w:cs/>
+                <w:lang w:bidi="ta-IN"/>
+              </w:rPr>
+              <w:t>ஸ்ரா</w:t>
+            </w:r>
+            <w:r>
+              <w:rPr>
+                <w:rFonts w:ascii="BRH Tamil Tab Extra" w:hAnsi="BRH Tamil Tab Extra" w:cs="Latha"/>
+                <w:b/>
+                <w:sz w:val="32"/>
+                <w:szCs w:val="28"/>
+                <w:lang w:bidi="ta-IN"/>
+              </w:rPr>
+              <w:t>…</w:t>
+            </w:r>
+            <w:r>
+              <w:rPr>
+                <w:rFonts w:ascii="Latha" w:hAnsi="Latha" w:cs="Latha"/>
+                <w:sz w:val="28"/>
+                <w:szCs w:val="28"/>
+                <w:cs/>
+                <w:lang w:bidi="ta-IN"/>
+              </w:rPr>
+              <w:t xml:space="preserve">வம் </w:t>
+            </w:r>
+            <w:r>
+              <w:rPr>
+                <w:rFonts w:ascii="Latha" w:hAnsi="Latha" w:cs="Latha"/>
+                <w:sz w:val="28"/>
+                <w:szCs w:val="28"/>
+                <w:lang w:bidi="ta-IN"/>
+              </w:rPr>
+              <w:t>|</w:t>
+            </w:r>
+          </w:p>
+        </w:tc>
+      </w:tr>
+      <w:tr>
+        <w:trPr>
+          <w:trHeight w:val="964"/>
+        </w:trPr>
+        <w:tc>
+          <w:tcPr>
+            <w:tcW w:w="3906" w:type="dxa"/>
+          </w:tcPr>
+          <w:p>
+            <w:pPr>
+              <w:widowControl w:val="0"/>
+              <w:tabs>
+                <w:tab w:val="left" w:pos="993"/>
+              </w:tabs>
+              <w:autoSpaceDE w:val="0"/>
+              <w:autoSpaceDN w:val="0"/>
+              <w:adjustRightInd w:val="0"/>
+              <w:spacing w:before="0" w:line="240" w:lineRule="auto"/>
+              <w:ind w:right="297"/>
+              <w:rPr>
+                <w:rFonts w:cs="Arial"/>
+                <w:b/>
+                <w:color w:val="000000" w:themeColor="text1"/>
+                <w:sz w:val="28"/>
+                <w:szCs w:val="32"/>
+              </w:rPr>
+            </w:pPr>
+            <w:r>
+              <w:rPr>
+                <w:rFonts w:cs="Arial"/>
+                <w:b/>
+                <w:color w:val="000000" w:themeColor="text1"/>
+                <w:sz w:val="28"/>
+                <w:szCs w:val="32"/>
+              </w:rPr>
+              <w:t>T.S.3.1.</w:t>
+            </w:r>
+            <w:r>
+              <w:rPr>
+                <w:rFonts w:cs="Arial"/>
+                <w:b/>
+                <w:color w:val="000000" w:themeColor="text1"/>
+                <w:sz w:val="28"/>
+                <w:szCs w:val="32"/>
+              </w:rPr>
+              <w:t>11.6</w:t>
+            </w:r>
+            <w:r>
+              <w:rPr>
+                <w:rFonts w:cs="Arial"/>
+                <w:b/>
+                <w:color w:val="000000" w:themeColor="text1"/>
+                <w:sz w:val="28"/>
+                <w:szCs w:val="32"/>
+              </w:rPr>
+              <w:t xml:space="preserve"> – Kramam</w:t>
+            </w:r>
+          </w:p>
+          <w:p>
+            <w:pPr>
+              <w:widowControl w:val="0"/>
+              <w:tabs>
+                <w:tab w:val="left" w:pos="993"/>
+              </w:tabs>
+              <w:autoSpaceDE w:val="0"/>
+              <w:autoSpaceDN w:val="0"/>
+              <w:adjustRightInd w:val="0"/>
+              <w:spacing w:before="0" w:line="240" w:lineRule="auto"/>
+              <w:ind w:right="297"/>
+              <w:rPr>
+                <w:rFonts w:cs="Arial"/>
+                <w:b/>
+                <w:color w:val="000000" w:themeColor="text1"/>
+                <w:szCs w:val="32"/>
+                <w:lang w:val="it-IT"/>
+              </w:rPr>
+            </w:pPr>
+            <w:r>
+              <w:rPr>
+                <w:rFonts w:cs="Arial"/>
+                <w:b/>
+                <w:color w:val="000000" w:themeColor="text1"/>
+                <w:sz w:val="28"/>
+                <w:szCs w:val="32"/>
+                <w:lang w:val="it-IT"/>
+              </w:rPr>
+              <w:t>Krama Vaakyam</w:t>
+            </w:r>
+            <w:r>
+              <w:rPr>
+                <w:rFonts w:cs="Arial"/>
+                <w:b/>
+                <w:color w:val="000000" w:themeColor="text1"/>
+                <w:szCs w:val="32"/>
+                <w:lang w:val="it-IT"/>
+              </w:rPr>
+              <w:t xml:space="preserve"> No.– 16 </w:t>
+            </w:r>
+          </w:p>
+          <w:p>
+            <w:pPr>
+              <w:widowControl w:val="0"/>
+              <w:tabs>
+                <w:tab w:val="left" w:pos="993"/>
+              </w:tabs>
+              <w:autoSpaceDE w:val="0"/>
+              <w:autoSpaceDN w:val="0"/>
+              <w:adjustRightInd w:val="0"/>
+              <w:spacing w:before="0" w:line="240" w:lineRule="auto"/>
+              <w:ind w:right="297"/>
+              <w:rPr>
+                <w:rFonts w:cs="Arial"/>
+                <w:b/>
+                <w:color w:val="000000" w:themeColor="text1"/>
+                <w:sz w:val="28"/>
+                <w:szCs w:val="32"/>
+                <w:lang w:val="it-IT"/>
+              </w:rPr>
+            </w:pPr>
+            <w:r>
+              <w:rPr>
+                <w:rFonts w:cs="Arial"/>
+                <w:b/>
+                <w:color w:val="000000" w:themeColor="text1"/>
+                <w:sz w:val="28"/>
+                <w:szCs w:val="32"/>
+                <w:lang w:val="it-IT"/>
+              </w:rPr>
+              <w:t>Panchaati No</w:t>
+            </w:r>
+            <w:r>
+              <w:rPr>
+                <w:rFonts w:cs="Arial"/>
+                <w:b/>
+                <w:color w:val="000000" w:themeColor="text1"/>
+                <w:szCs w:val="32"/>
+                <w:lang w:val="it-IT"/>
+              </w:rPr>
+              <w:t xml:space="preserve">. - </w:t>
+            </w:r>
+            <w:r>
+              <w:rPr>
+                <w:rFonts w:cs="Arial"/>
+                <w:b/>
+                <w:color w:val="000000" w:themeColor="text1"/>
+                <w:sz w:val="28"/>
+                <w:szCs w:val="32"/>
+                <w:lang w:val="it-IT"/>
+              </w:rPr>
+              <w:t>40</w:t>
+            </w:r>
+          </w:p>
+        </w:tc>
+        <w:tc>
+          <w:tcPr>
+            <w:tcW w:w="5103" w:type="dxa"/>
+          </w:tcPr>
+          <w:p>
+            <w:pPr>
+              <w:widowControl w:val="0"/>
+              <w:autoSpaceDE w:val="0"/>
+              <w:autoSpaceDN w:val="0"/>
+              <w:adjustRightInd w:val="0"/>
+              <w:spacing w:before="0" w:line="240" w:lineRule="auto"/>
+              <w:rPr>
+                <w:rFonts w:ascii="BRH Devanagari Extra" w:hAnsi="BRH Devanagari Extra" w:cs="BRH Devanagari Extra"/>
+                <w:color w:val="000000"/>
+                <w:sz w:val="40"/>
+                <w:szCs w:val="40"/>
+                <w:lang w:val="it-IT"/>
+              </w:rPr>
+            </w:pPr>
+            <w:r>
+              <w:rPr>
+                <w:rFonts w:ascii="Latha" w:hAnsi="Latha" w:cs="Latha"/>
+                <w:sz w:val="28"/>
+                <w:szCs w:val="28"/>
+                <w:cs/>
+                <w:lang w:bidi="ta-IN"/>
+              </w:rPr>
+              <w:t>பரி</w:t>
+            </w:r>
+            <w:r>
+              <w:rPr>
+                <w:rFonts w:ascii="BRH Tamil Tab Extra" w:hAnsi="BRH Tamil Tab Extra" w:cs="Latha"/>
+                <w:b/>
+                <w:sz w:val="36"/>
+                <w:szCs w:val="28"/>
+                <w:lang w:bidi="ta-IN"/>
+              </w:rPr>
+              <w:t>†</w:t>
+            </w:r>
+            <w:r>
+              <w:rPr>
+                <w:rFonts w:ascii="Latha" w:hAnsi="Latha" w:cs="Latha"/>
+                <w:sz w:val="28"/>
+                <w:szCs w:val="28"/>
+                <w:lang w:bidi="ta-IN"/>
+              </w:rPr>
+              <w:t xml:space="preserve"> </w:t>
+            </w:r>
+            <w:r>
+              <w:rPr>
+                <w:rFonts w:ascii="Latha" w:hAnsi="Latha" w:cs="Latha"/>
+                <w:sz w:val="28"/>
+                <w:szCs w:val="28"/>
+                <w:cs/>
+                <w:lang w:bidi="ta-IN"/>
+              </w:rPr>
+              <w:t>தீ</w:t>
+            </w:r>
+            <w:r>
+              <w:rPr>
+                <w:rFonts w:ascii="Latha" w:hAnsi="Latha" w:cs="Latha"/>
+                <w:b/>
+                <w:bCs/>
+                <w:position w:val="-12"/>
+                <w:sz w:val="28"/>
+                <w:szCs w:val="28"/>
+                <w:cs/>
+                <w:lang w:bidi="ta-IN"/>
+              </w:rPr>
+              <w:t>3</w:t>
+            </w:r>
+            <w:r>
+              <w:rPr>
+                <w:rFonts w:ascii="Latha" w:hAnsi="Latha" w:cs="Latha"/>
+                <w:sz w:val="28"/>
+                <w:szCs w:val="28"/>
+                <w:cs/>
+                <w:lang w:bidi="ta-IN"/>
+              </w:rPr>
+              <w:t xml:space="preserve">ய </w:t>
+            </w:r>
+            <w:r>
+              <w:rPr>
+                <w:rFonts w:ascii="Latha" w:hAnsi="Latha" w:cs="Latha"/>
+                <w:sz w:val="28"/>
+                <w:szCs w:val="28"/>
+                <w:lang w:bidi="ta-IN"/>
+              </w:rPr>
+              <w:t xml:space="preserve">| </w:t>
+            </w:r>
+            <w:r>
+              <w:rPr>
+                <w:rFonts w:ascii="Latha" w:hAnsi="Latha" w:cs="Latha"/>
+                <w:sz w:val="28"/>
+                <w:szCs w:val="28"/>
+                <w:cs/>
+                <w:lang w:bidi="ta-IN"/>
+              </w:rPr>
+              <w:t>தீ</w:t>
+            </w:r>
+            <w:r>
+              <w:rPr>
+                <w:rFonts w:ascii="BRH Tamil Tab Extra" w:hAnsi="BRH Tamil Tab Extra" w:cs="Latha"/>
+                <w:b/>
+                <w:sz w:val="32"/>
+                <w:szCs w:val="28"/>
+                <w:lang w:bidi="ta-IN"/>
+              </w:rPr>
+              <w:t>…</w:t>
+            </w:r>
+            <w:r>
+              <w:rPr>
+                <w:rFonts w:ascii="Latha" w:hAnsi="Latha" w:cs="Latha"/>
+                <w:b/>
+                <w:bCs/>
+                <w:position w:val="-12"/>
+                <w:sz w:val="28"/>
+                <w:szCs w:val="28"/>
+                <w:highlight w:val="yellow"/>
+                <w:cs/>
+                <w:lang w:bidi="ta-IN"/>
+              </w:rPr>
+              <w:t>3</w:t>
+            </w:r>
+            <w:r>
+              <w:rPr>
+                <w:rFonts w:ascii="Latha" w:hAnsi="Latha" w:cs="Latha"/>
+                <w:sz w:val="28"/>
+                <w:szCs w:val="28"/>
+                <w:highlight w:val="yellow"/>
+                <w:cs/>
+                <w:lang w:bidi="ta-IN"/>
+              </w:rPr>
+              <w:t>ய</w:t>
+            </w:r>
+            <w:r>
+              <w:rPr>
+                <w:rFonts w:ascii="BRH Tamil Tab Extra" w:hAnsi="BRH Tamil Tab Extra" w:cs="Latha"/>
+                <w:b/>
+                <w:sz w:val="32"/>
+                <w:szCs w:val="28"/>
+                <w:highlight w:val="yellow"/>
+                <w:lang w:bidi="ta-IN"/>
+              </w:rPr>
+              <w:t>…</w:t>
+            </w:r>
+            <w:r>
+              <w:rPr>
+                <w:rFonts w:ascii="Latha" w:hAnsi="Latha" w:cs="Latha"/>
+                <w:sz w:val="28"/>
+                <w:szCs w:val="28"/>
+                <w:lang w:bidi="ta-IN"/>
+              </w:rPr>
+              <w:t xml:space="preserve"> </w:t>
+            </w:r>
+            <w:r>
+              <w:rPr>
+                <w:rFonts w:ascii="Latha" w:hAnsi="Latha" w:cs="Latha"/>
+                <w:sz w:val="28"/>
+                <w:szCs w:val="28"/>
+                <w:cs/>
+                <w:lang w:bidi="ta-IN"/>
+              </w:rPr>
+              <w:t>ரதே</w:t>
+            </w:r>
+            <w:r>
+              <w:rPr>
+                <w:rFonts w:ascii="BRH Tamil Tab Extra" w:hAnsi="BRH Tamil Tab Extra" w:cs="Latha"/>
+                <w:b/>
+                <w:sz w:val="36"/>
+                <w:szCs w:val="28"/>
+                <w:lang w:bidi="ta-IN"/>
+              </w:rPr>
+              <w:t>†</w:t>
+            </w:r>
+            <w:r>
+              <w:rPr>
+                <w:rFonts w:ascii="Latha" w:hAnsi="Latha" w:cs="Latha"/>
+                <w:b/>
+                <w:bCs/>
+                <w:position w:val="-12"/>
+                <w:sz w:val="28"/>
+                <w:szCs w:val="28"/>
+                <w:cs/>
+                <w:lang w:bidi="ta-IN"/>
+              </w:rPr>
+              <w:t>2</w:t>
+            </w:r>
+            <w:r>
+              <w:rPr>
+                <w:rFonts w:ascii="Latha" w:hAnsi="Latha" w:cs="Latha"/>
+                <w:sz w:val="28"/>
+                <w:szCs w:val="28"/>
+                <w:cs/>
+                <w:lang w:bidi="ta-IN"/>
+              </w:rPr>
+              <w:t xml:space="preserve">ன </w:t>
+            </w:r>
+            <w:r>
+              <w:rPr>
+                <w:rFonts w:ascii="Latha" w:hAnsi="Latha" w:cs="Latha"/>
+                <w:sz w:val="28"/>
+                <w:szCs w:val="28"/>
+                <w:lang w:bidi="ta-IN"/>
+              </w:rPr>
+              <w:t>|</w:t>
+            </w:r>
+          </w:p>
+        </w:tc>
+        <w:tc>
+          <w:tcPr>
+            <w:tcW w:w="5386" w:type="dxa"/>
+          </w:tcPr>
+          <w:p>
+            <w:pPr>
+              <w:widowControl w:val="0"/>
+              <w:autoSpaceDE w:val="0"/>
+              <w:autoSpaceDN w:val="0"/>
+              <w:adjustRightInd w:val="0"/>
+              <w:spacing w:before="0" w:line="240" w:lineRule="auto"/>
+              <w:rPr>
+                <w:rFonts w:ascii="BRH Devanagari Extra" w:hAnsi="BRH Devanagari Extra" w:cs="BRH Devanagari Extra"/>
+                <w:color w:val="000000"/>
+                <w:sz w:val="40"/>
+                <w:szCs w:val="40"/>
+                <w:lang w:val="it-IT"/>
+              </w:rPr>
+            </w:pPr>
+            <w:r>
+              <w:rPr>
+                <w:rFonts w:ascii="Latha" w:hAnsi="Latha" w:cs="Latha"/>
+                <w:sz w:val="28"/>
+                <w:szCs w:val="28"/>
+                <w:cs/>
+                <w:lang w:bidi="ta-IN"/>
+              </w:rPr>
+              <w:t>பரி</w:t>
+            </w:r>
+            <w:r>
+              <w:rPr>
+                <w:rFonts w:ascii="BRH Tamil Tab Extra" w:hAnsi="BRH Tamil Tab Extra" w:cs="Latha"/>
+                <w:b/>
+                <w:sz w:val="36"/>
+                <w:szCs w:val="28"/>
+                <w:lang w:bidi="ta-IN"/>
+              </w:rPr>
+              <w:t>†</w:t>
+            </w:r>
+            <w:r>
+              <w:rPr>
+                <w:rFonts w:ascii="Latha" w:hAnsi="Latha" w:cs="Latha"/>
+                <w:sz w:val="28"/>
+                <w:szCs w:val="28"/>
+                <w:lang w:bidi="ta-IN"/>
+              </w:rPr>
+              <w:t xml:space="preserve"> </w:t>
+            </w:r>
+            <w:r>
+              <w:rPr>
+                <w:rFonts w:ascii="Latha" w:hAnsi="Latha" w:cs="Latha"/>
+                <w:sz w:val="28"/>
+                <w:szCs w:val="28"/>
+                <w:cs/>
+                <w:lang w:bidi="ta-IN"/>
+              </w:rPr>
+              <w:t>தீ</w:t>
+            </w:r>
+            <w:r>
+              <w:rPr>
+                <w:rFonts w:ascii="Latha" w:hAnsi="Latha" w:cs="Latha"/>
+                <w:b/>
+                <w:bCs/>
+                <w:position w:val="-12"/>
+                <w:sz w:val="28"/>
+                <w:szCs w:val="28"/>
+                <w:cs/>
+                <w:lang w:bidi="ta-IN"/>
+              </w:rPr>
+              <w:t>3</w:t>
+            </w:r>
+            <w:r>
+              <w:rPr>
+                <w:rFonts w:ascii="Latha" w:hAnsi="Latha" w:cs="Latha"/>
+                <w:sz w:val="28"/>
+                <w:szCs w:val="28"/>
+                <w:cs/>
+                <w:lang w:bidi="ta-IN"/>
+              </w:rPr>
+              <w:t xml:space="preserve">ய </w:t>
+            </w:r>
+            <w:r>
+              <w:rPr>
+                <w:rFonts w:ascii="Latha" w:hAnsi="Latha" w:cs="Latha"/>
+                <w:sz w:val="28"/>
+                <w:szCs w:val="28"/>
+                <w:lang w:bidi="ta-IN"/>
+              </w:rPr>
+              <w:t xml:space="preserve">| </w:t>
+            </w:r>
+            <w:r>
+              <w:rPr>
+                <w:rFonts w:ascii="Latha" w:hAnsi="Latha" w:cs="Latha"/>
+                <w:sz w:val="28"/>
+                <w:szCs w:val="28"/>
+                <w:highlight w:val="green"/>
+                <w:cs/>
+                <w:lang w:bidi="ta-IN"/>
+              </w:rPr>
+              <w:t>தீ</w:t>
+            </w:r>
+            <w:r>
+              <w:rPr>
+                <w:rFonts w:ascii="BRH Tamil Tab Extra" w:hAnsi="BRH Tamil Tab Extra" w:cs="Latha"/>
+                <w:b/>
+                <w:sz w:val="32"/>
+                <w:szCs w:val="28"/>
+                <w:highlight w:val="green"/>
+                <w:lang w:bidi="ta-IN"/>
+              </w:rPr>
+              <w:t>…</w:t>
+            </w:r>
+            <w:r>
+              <w:rPr>
+                <w:rFonts w:ascii="Latha" w:hAnsi="Latha" w:cs="Latha"/>
+                <w:b/>
+                <w:bCs/>
+                <w:position w:val="-12"/>
+                <w:sz w:val="28"/>
+                <w:szCs w:val="28"/>
+                <w:highlight w:val="green"/>
+                <w:cs/>
+                <w:lang w:bidi="ta-IN"/>
+              </w:rPr>
+              <w:t>3</w:t>
+            </w:r>
+            <w:r>
+              <w:rPr>
+                <w:rFonts w:ascii="Latha" w:hAnsi="Latha" w:cs="Latha" w:hint="cs"/>
+                <w:sz w:val="28"/>
+                <w:szCs w:val="28"/>
+                <w:highlight w:val="green"/>
+                <w:cs/>
+                <w:lang w:bidi="ta-IN"/>
+              </w:rPr>
+              <w:t>யா</w:t>
+            </w:r>
+            <w:r>
+              <w:rPr>
+                <w:rFonts w:ascii="BRH Tamil Tab Extra" w:hAnsi="BRH Tamil Tab Extra" w:cs="Latha"/>
+                <w:b/>
+                <w:sz w:val="32"/>
+                <w:szCs w:val="28"/>
+                <w:highlight w:val="green"/>
+                <w:lang w:bidi="ta-IN"/>
+              </w:rPr>
+              <w:t>…</w:t>
+            </w:r>
+            <w:r>
+              <w:rPr>
+                <w:rFonts w:ascii="Latha" w:hAnsi="Latha" w:cs="Latha"/>
+                <w:sz w:val="28"/>
+                <w:szCs w:val="28"/>
+                <w:lang w:bidi="ta-IN"/>
+              </w:rPr>
+              <w:t xml:space="preserve"> </w:t>
+            </w:r>
+            <w:r>
+              <w:rPr>
+                <w:rFonts w:ascii="Latha" w:hAnsi="Latha" w:cs="Latha"/>
+                <w:sz w:val="28"/>
+                <w:szCs w:val="28"/>
+                <w:cs/>
+                <w:lang w:bidi="ta-IN"/>
+              </w:rPr>
+              <w:t>ரதே</w:t>
+            </w:r>
+            <w:r>
+              <w:rPr>
+                <w:rFonts w:ascii="BRH Tamil Tab Extra" w:hAnsi="BRH Tamil Tab Extra" w:cs="Latha"/>
+                <w:b/>
+                <w:sz w:val="36"/>
+                <w:szCs w:val="28"/>
+                <w:lang w:bidi="ta-IN"/>
+              </w:rPr>
+              <w:t>†</w:t>
+            </w:r>
+            <w:r>
+              <w:rPr>
+                <w:rFonts w:ascii="Latha" w:hAnsi="Latha" w:cs="Latha"/>
+                <w:b/>
+                <w:bCs/>
+                <w:position w:val="-12"/>
+                <w:sz w:val="28"/>
+                <w:szCs w:val="28"/>
+                <w:cs/>
+                <w:lang w:bidi="ta-IN"/>
+              </w:rPr>
+              <w:t>2</w:t>
+            </w:r>
+            <w:r>
+              <w:rPr>
+                <w:rFonts w:ascii="Latha" w:hAnsi="Latha" w:cs="Latha"/>
+                <w:sz w:val="28"/>
+                <w:szCs w:val="28"/>
+                <w:cs/>
+                <w:lang w:bidi="ta-IN"/>
+              </w:rPr>
+              <w:t xml:space="preserve">ன </w:t>
+            </w:r>
+            <w:r>
+              <w:rPr>
+                <w:rFonts w:ascii="Latha" w:hAnsi="Latha" w:cs="Latha"/>
+                <w:sz w:val="28"/>
+                <w:szCs w:val="28"/>
+                <w:lang w:bidi="ta-IN"/>
+              </w:rPr>
+              <w:t>|</w:t>
+            </w:r>
+          </w:p>
+        </w:tc>
+      </w:tr>
+    </w:tbl>
+    <w:p>
+      <w:pPr>
+        <w:jc w:val="center"/>
+        <w:rPr>
+          <w:b/>
+          <w:bCs/>
+          <w:sz w:val="32"/>
+          <w:szCs w:val="32"/>
+          <w:u w:val="single"/>
+        </w:rPr>
+      </w:pPr>
+      <w:r>
+        <w:rPr>
+          <w:b/>
+          <w:bCs/>
+          <w:sz w:val="32"/>
+          <w:szCs w:val="32"/>
+          <w:u w:val="single"/>
+        </w:rPr>
+        <w:t>==========</w:t>
+      </w:r>
+    </w:p>
     <w:p>
       <w:pPr>
         <w:jc w:val="center"/>
@@ -108,23 +1689,7 @@
           <w:b/>
           <w:bCs/>
         </w:rPr>
-        <w:t>(</w:t>
-      </w:r>
-      <w:proofErr w:type="gramStart"/>
-      <w:r>
-        <w:rPr>
-          <w:b/>
-          <w:bCs/>
-        </w:rPr>
-        <w:t>ignore</w:t>
-      </w:r>
-      <w:proofErr w:type="gramEnd"/>
-      <w:r>
-        <w:rPr>
-          <w:b/>
-          <w:bCs/>
-        </w:rPr>
-        <w:t xml:space="preserve"> those which are already incorporated in your book’s version and date)</w:t>
+        <w:t>(ignore those which are already incorporated in your book’s version and date)</w:t>
       </w:r>
     </w:p>
     <w:tbl>
@@ -998,6 +2563,7 @@
                 <w:cs/>
                 <w:lang w:bidi="ta-IN"/>
               </w:rPr>
+              <w:lastRenderedPageBreak/>
               <w:t>ஶு</w:t>
             </w:r>
             <w:r>
@@ -1120,6 +2686,7 @@
                 <w:cs/>
                 <w:lang w:bidi="ta-IN"/>
               </w:rPr>
+              <w:lastRenderedPageBreak/>
               <w:t>ச</w:t>
             </w:r>
             <w:r>
@@ -1246,6 +2813,7 @@
                 <w:cs/>
                 <w:lang w:bidi="ta-IN"/>
               </w:rPr>
+              <w:lastRenderedPageBreak/>
               <w:t>ஶு</w:t>
             </w:r>
             <w:r>
@@ -1361,20 +2929,9 @@
           <w:szCs w:val="32"/>
           <w:u w:val="single"/>
         </w:rPr>
+        <w:lastRenderedPageBreak/>
         <w:t>==========</w:t>
       </w:r>
-    </w:p>
-    <w:p>
-      <w:pPr>
-        <w:jc w:val="center"/>
-        <w:rPr>
-          <w:b/>
-          <w:bCs/>
-          <w:sz w:val="32"/>
-          <w:szCs w:val="32"/>
-          <w:u w:val="single"/>
-        </w:rPr>
-      </w:pPr>
     </w:p>
     <w:p>
       <w:pPr>
@@ -2705,7 +4262,6 @@
                 <w:sz w:val="28"/>
                 <w:szCs w:val="32"/>
               </w:rPr>
-              <w:lastRenderedPageBreak/>
               <w:t>T.S.</w:t>
             </w:r>
             <w:r>
@@ -3480,21 +5036,12 @@
               </w:rPr>
               <w:t xml:space="preserve"> </w:t>
             </w:r>
-            <w:proofErr w:type="spellStart"/>
             <w:r>
               <w:rPr>
                 <w:b/>
                 <w:bCs/>
               </w:rPr>
-              <w:t>deergham</w:t>
-            </w:r>
-            <w:proofErr w:type="spellEnd"/>
-            <w:r>
-              <w:rPr>
-                <w:b/>
-                <w:bCs/>
-              </w:rPr>
-              <w:t>)</w:t>
+              <w:t>deergham)</w:t>
             </w:r>
           </w:p>
         </w:tc>
@@ -4317,6 +5864,7 @@
                 <w:sz w:val="28"/>
                 <w:szCs w:val="32"/>
               </w:rPr>
+              <w:lastRenderedPageBreak/>
               <w:t>T.S.</w:t>
             </w:r>
             <w:r>
@@ -5692,7 +7240,6 @@
               </w:rPr>
               <w:t>வ</w:t>
             </w:r>
-            <w:proofErr w:type="spellStart"/>
             <w:r>
               <w:rPr>
                 <w:rFonts w:ascii="BRH Devanagari Extra" w:hAnsi="BRH Devanagari Extra" w:cs="Latha"/>
@@ -5703,7 +7250,6 @@
               </w:rPr>
               <w:t>óè</w:t>
             </w:r>
-            <w:proofErr w:type="spellEnd"/>
             <w:r>
               <w:rPr>
                 <w:rFonts w:ascii="Latha" w:hAnsi="Latha" w:cs="Latha"/>
@@ -5924,7 +7470,6 @@
               </w:rPr>
               <w:t>வ</w:t>
             </w:r>
-            <w:proofErr w:type="spellStart"/>
             <w:r>
               <w:rPr>
                 <w:rFonts w:ascii="BRH Devanagari Extra" w:hAnsi="BRH Devanagari Extra" w:cs="Latha"/>
@@ -5935,7 +7480,6 @@
               </w:rPr>
               <w:t>óè</w:t>
             </w:r>
-            <w:proofErr w:type="spellEnd"/>
             <w:r>
               <w:rPr>
                 <w:rFonts w:ascii="Latha" w:hAnsi="Latha" w:cs="Latha"/>
@@ -6152,29 +7696,7 @@
           <w:szCs w:val="40"/>
           <w:lang w:val="en-IN" w:eastAsia="en-IN"/>
         </w:rPr>
-        <w:t>"</w:t>
-      </w:r>
-      <w:proofErr w:type="spellStart"/>
-      <w:r>
-        <w:rPr>
-          <w:rFonts w:ascii="BRH Devanagari" w:hAnsi="BRH Devanagari" w:cs="BRH Devanagari"/>
-          <w:color w:val="000000"/>
-          <w:sz w:val="40"/>
-          <w:szCs w:val="40"/>
-          <w:lang w:val="en-IN" w:eastAsia="en-IN"/>
-        </w:rPr>
-        <w:t>zlÉ</w:t>
-      </w:r>
-      <w:proofErr w:type="spellEnd"/>
-      <w:r>
-        <w:rPr>
-          <w:rFonts w:ascii="BRH Devanagari" w:hAnsi="BRH Devanagari" w:cs="BRH Devanagari"/>
-          <w:color w:val="000000"/>
-          <w:sz w:val="40"/>
-          <w:szCs w:val="40"/>
-          <w:lang w:val="en-IN" w:eastAsia="en-IN"/>
-        </w:rPr>
-        <w:t xml:space="preserve">" </w:t>
+        <w:t xml:space="preserve">"zlÉ" </w:t>
       </w:r>
       <w:r>
         <w:rPr>
@@ -6182,16 +7704,7 @@
           <w:bCs/>
           <w:sz w:val="32"/>
         </w:rPr>
-        <w:t xml:space="preserve">replaced </w:t>
-      </w:r>
-      <w:proofErr w:type="gramStart"/>
-      <w:r>
-        <w:rPr>
-          <w:b/>
-          <w:bCs/>
-          <w:sz w:val="32"/>
-        </w:rPr>
-        <w:t>with</w:t>
+        <w:t>replaced with</w:t>
       </w:r>
       <w:r>
         <w:rPr>
@@ -6213,8 +7726,6 @@
         </w:rPr>
         <w:t>"</w:t>
       </w:r>
-      <w:proofErr w:type="spellStart"/>
-      <w:proofErr w:type="gramEnd"/>
       <w:r>
         <w:rPr>
           <w:rFonts w:ascii="BRH Devanagari" w:hAnsi="BRH Devanagari" w:cs="BRH Devanagari"/>
@@ -6226,7 +7737,6 @@
         </w:rPr>
         <w:t>zgÉ</w:t>
       </w:r>
-      <w:proofErr w:type="spellEnd"/>
       <w:r>
         <w:rPr>
           <w:rFonts w:ascii="BRH Devanagari" w:hAnsi="BRH Devanagari" w:cs="BRH Devanagari"/>
@@ -6269,7 +7779,6 @@
         <w:t>=========================</w:t>
       </w:r>
     </w:p>
-    <w:p/>
     <w:p>
       <w:pPr>
         <w:jc w:val="center"/>
@@ -6603,13 +8112,6 @@
       <w:pPr>
         <w:ind w:left="-709" w:firstLine="709"/>
         <w:jc w:val="center"/>
-        <w:rPr>
-          <w:b/>
-          <w:bCs/>
-          <w:sz w:val="32"/>
-          <w:szCs w:val="32"/>
-          <w:u w:val="single"/>
-        </w:rPr>
       </w:pPr>
       <w:r>
         <w:rPr>
@@ -6622,12 +8124,13 @@
         <w:t>=========================</w:t>
       </w:r>
     </w:p>
-    <w:p/>
     <w:sectPr>
       <w:headerReference w:type="even" r:id="rId7"/>
       <w:headerReference w:type="default" r:id="rId8"/>
       <w:footerReference w:type="even" r:id="rId9"/>
       <w:footerReference w:type="default" r:id="rId10"/>
+      <w:headerReference w:type="first" r:id="rId11"/>
+      <w:footerReference w:type="first" r:id="rId12"/>
       <w:pgSz w:w="15840" w:h="12240" w:orient="landscape"/>
       <w:pgMar w:top="1440" w:right="1440" w:bottom="1440" w:left="1440" w:header="720" w:footer="720" w:gutter="0"/>
       <w:cols w:space="720"/>
@@ -6638,7 +8141,7 @@
 </file>
 
 <file path=word/endnotes.xml><?xml version="1.0" encoding="utf-8"?>
-<w:endnotes xmlns:wpc="http://schemas.microsoft.com/office/word/2010/wordprocessingCanvas" xmlns:cx="http://schemas.microsoft.com/office/drawing/2014/chartex" xmlns:cx1="http://schemas.microsoft.com/office/drawing/2015/9/8/chartex" xmlns:cx2="http://schemas.microsoft.com/office/drawing/2015/10/21/chartex" xmlns:cx3="http://schemas.microsoft.com/office/drawing/2016/5/9/chartex" xmlns:cx4="http://schemas.microsoft.com/office/drawing/2016/5/10/chartex" xmlns:cx5="http://schemas.microsoft.com/office/drawing/2016/5/11/chartex" xmlns:cx6="http://schemas.microsoft.com/office/drawing/2016/5/12/chartex" xmlns:cx7="http://schemas.microsoft.com/office/drawing/2016/5/13/chartex" xmlns:cx8="http://schemas.microsoft.com/office/drawing/2016/5/14/chartex" xmlns:mc="http://schemas.openxmlformats.org/markup-compatibility/2006" xmlns:aink="http://schemas.microsoft.com/office/drawing/2016/ink" xmlns:am3d="http://schemas.microsoft.com/office/drawing/2017/model3d" xmlns:o="urn:schemas-microsoft-com:office:office" xmlns:oel="http://schemas.microsoft.com/office/2019/extlst" xmlns:r="http://schemas.openxmlformats.org/officeDocument/2006/relationships" xmlns:m="http://schemas.openxmlformats.org/officeDocument/2006/math" xmlns:v="urn:schemas-microsoft-com:vml" xmlns:wp14="http://schemas.microsoft.com/office/word/2010/wordprocessingDrawing" xmlns:wp="http://schemas.openxmlformats.org/drawingml/2006/wordprocessingDrawing" xmlns:w10="urn:schemas-microsoft-com:office:word" xmlns:w="http://schemas.openxmlformats.org/wordprocessingml/2006/main" xmlns:w14="http://schemas.microsoft.com/office/word/2010/wordml" xmlns:w15="http://schemas.microsoft.com/office/word/2012/wordml" xmlns:w16cex="http://schemas.microsoft.com/office/word/2018/wordml/cex" xmlns:w16cid="http://schemas.microsoft.com/office/word/2016/wordml/cid" xmlns:w16="http://schemas.microsoft.com/office/word/2018/wordml" xmlns:w16sdtdh="http://schemas.microsoft.com/office/word/2020/wordml/sdtdatahash" xmlns:w16se="http://schemas.microsoft.com/office/word/2015/wordml/symex" xmlns:wpg="http://schemas.microsoft.com/office/word/2010/wordprocessingGroup" xmlns:wpi="http://schemas.microsoft.com/office/word/2010/wordprocessingInk" xmlns:wne="http://schemas.microsoft.com/office/word/2006/wordml" xmlns:wps="http://schemas.microsoft.com/office/word/2010/wordprocessingShape" mc:Ignorable="w14 w15 w16se w16cid w16 w16cex w16sdtdh wp14">
+<w:endnotes xmlns:wpc="http://schemas.microsoft.com/office/word/2010/wordprocessingCanvas" xmlns:cx="http://schemas.microsoft.com/office/drawing/2014/chartex" xmlns:cx1="http://schemas.microsoft.com/office/drawing/2015/9/8/chartex" xmlns:cx2="http://schemas.microsoft.com/office/drawing/2015/10/21/chartex" xmlns:cx3="http://schemas.microsoft.com/office/drawing/2016/5/9/chartex" xmlns:cx4="http://schemas.microsoft.com/office/drawing/2016/5/10/chartex" xmlns:cx5="http://schemas.microsoft.com/office/drawing/2016/5/11/chartex" xmlns:cx6="http://schemas.microsoft.com/office/drawing/2016/5/12/chartex" xmlns:cx7="http://schemas.microsoft.com/office/drawing/2016/5/13/chartex" xmlns:cx8="http://schemas.microsoft.com/office/drawing/2016/5/14/chartex" xmlns:mc="http://schemas.openxmlformats.org/markup-compatibility/2006" xmlns:aink="http://schemas.microsoft.com/office/drawing/2016/ink" xmlns:am3d="http://schemas.microsoft.com/office/drawing/2017/model3d" xmlns:o="urn:schemas-microsoft-com:office:office" xmlns:oel="http://schemas.microsoft.com/office/2019/extlst" xmlns:r="http://schemas.openxmlformats.org/officeDocument/2006/relationships" xmlns:m="http://schemas.openxmlformats.org/officeDocument/2006/math" xmlns:v="urn:schemas-microsoft-com:vml" xmlns:wp14="http://schemas.microsoft.com/office/word/2010/wordprocessingDrawing" xmlns:wp="http://schemas.openxmlformats.org/drawingml/2006/wordprocessingDrawing" xmlns:w10="urn:schemas-microsoft-com:office:word" xmlns:w="http://schemas.openxmlformats.org/wordprocessingml/2006/main" xmlns:w14="http://schemas.microsoft.com/office/word/2010/wordml" xmlns:w15="http://schemas.microsoft.com/office/word/2012/wordml" xmlns:w16cex="http://schemas.microsoft.com/office/word/2018/wordml/cex" xmlns:w16cid="http://schemas.microsoft.com/office/word/2016/wordml/cid" xmlns:w16="http://schemas.microsoft.com/office/word/2018/wordml" xmlns:w16du="http://schemas.microsoft.com/office/word/2023/wordml/word16du" xmlns:w16sdtdh="http://schemas.microsoft.com/office/word/2020/wordml/sdtdatahash" xmlns:w16sdtfl="http://schemas.microsoft.com/office/word/2024/wordml/sdtformatlock" xmlns:w16se="http://schemas.microsoft.com/office/word/2015/wordml/symex" xmlns:wpg="http://schemas.microsoft.com/office/word/2010/wordprocessingGroup" xmlns:wpi="http://schemas.microsoft.com/office/word/2010/wordprocessingInk" xmlns:wne="http://schemas.microsoft.com/office/word/2006/wordml" xmlns:wps="http://schemas.microsoft.com/office/word/2010/wordprocessingShape" mc:Ignorable="w14 w15 w16se w16cid w16 w16cex w16sdtdh w16sdtfl w16du wp14">
   <w:endnote w:type="separator" w:id="-1">
     <w:p>
       <w:pPr>
@@ -6663,12 +8166,13 @@
 </file>
 
 <file path=word/footer1.xml><?xml version="1.0" encoding="utf-8"?>
-<w:ftr xmlns:wpc="http://schemas.microsoft.com/office/word/2010/wordprocessingCanvas" xmlns:cx="http://schemas.microsoft.com/office/drawing/2014/chartex" xmlns:cx1="http://schemas.microsoft.com/office/drawing/2015/9/8/chartex" xmlns:cx2="http://schemas.microsoft.com/office/drawing/2015/10/21/chartex" xmlns:cx3="http://schemas.microsoft.com/office/drawing/2016/5/9/chartex" xmlns:cx4="http://schemas.microsoft.com/office/drawing/2016/5/10/chartex" xmlns:cx5="http://schemas.microsoft.com/office/drawing/2016/5/11/chartex" xmlns:cx6="http://schemas.microsoft.com/office/drawing/2016/5/12/chartex" xmlns:cx7="http://schemas.microsoft.com/office/drawing/2016/5/13/chartex" xmlns:cx8="http://schemas.microsoft.com/office/drawing/2016/5/14/chartex" xmlns:mc="http://schemas.openxmlformats.org/markup-compatibility/2006" xmlns:aink="http://schemas.microsoft.com/office/drawing/2016/ink" xmlns:am3d="http://schemas.microsoft.com/office/drawing/2017/model3d" xmlns:o="urn:schemas-microsoft-com:office:office" xmlns:oel="http://schemas.microsoft.com/office/2019/extlst" xmlns:r="http://schemas.openxmlformats.org/officeDocument/2006/relationships" xmlns:m="http://schemas.openxmlformats.org/officeDocument/2006/math" xmlns:v="urn:schemas-microsoft-com:vml" xmlns:wp14="http://schemas.microsoft.com/office/word/2010/wordprocessingDrawing" xmlns:wp="http://schemas.openxmlformats.org/drawingml/2006/wordprocessingDrawing" xmlns:w10="urn:schemas-microsoft-com:office:word" xmlns:w="http://schemas.openxmlformats.org/wordprocessingml/2006/main" xmlns:w14="http://schemas.microsoft.com/office/word/2010/wordml" xmlns:w15="http://schemas.microsoft.com/office/word/2012/wordml" xmlns:w16cex="http://schemas.microsoft.com/office/word/2018/wordml/cex" xmlns:w16cid="http://schemas.microsoft.com/office/word/2016/wordml/cid" xmlns:w16="http://schemas.microsoft.com/office/word/2018/wordml" xmlns:w16sdtdh="http://schemas.microsoft.com/office/word/2020/wordml/sdtdatahash" xmlns:w16se="http://schemas.microsoft.com/office/word/2015/wordml/symex" xmlns:wpg="http://schemas.microsoft.com/office/word/2010/wordprocessingGroup" xmlns:wpi="http://schemas.microsoft.com/office/word/2010/wordprocessingInk" xmlns:wne="http://schemas.microsoft.com/office/word/2006/wordml" xmlns:wps="http://schemas.microsoft.com/office/word/2010/wordprocessingShape" mc:Ignorable="w14 w15 w16se w16cid w16 w16cex w16sdtdh wp14">
+<w:ftr xmlns:wpc="http://schemas.microsoft.com/office/word/2010/wordprocessingCanvas" xmlns:cx="http://schemas.microsoft.com/office/drawing/2014/chartex" xmlns:cx1="http://schemas.microsoft.com/office/drawing/2015/9/8/chartex" xmlns:cx2="http://schemas.microsoft.com/office/drawing/2015/10/21/chartex" xmlns:cx3="http://schemas.microsoft.com/office/drawing/2016/5/9/chartex" xmlns:cx4="http://schemas.microsoft.com/office/drawing/2016/5/10/chartex" xmlns:cx5="http://schemas.microsoft.com/office/drawing/2016/5/11/chartex" xmlns:cx6="http://schemas.microsoft.com/office/drawing/2016/5/12/chartex" xmlns:cx7="http://schemas.microsoft.com/office/drawing/2016/5/13/chartex" xmlns:cx8="http://schemas.microsoft.com/office/drawing/2016/5/14/chartex" xmlns:mc="http://schemas.openxmlformats.org/markup-compatibility/2006" xmlns:aink="http://schemas.microsoft.com/office/drawing/2016/ink" xmlns:am3d="http://schemas.microsoft.com/office/drawing/2017/model3d" xmlns:o="urn:schemas-microsoft-com:office:office" xmlns:oel="http://schemas.microsoft.com/office/2019/extlst" xmlns:r="http://schemas.openxmlformats.org/officeDocument/2006/relationships" xmlns:m="http://schemas.openxmlformats.org/officeDocument/2006/math" xmlns:v="urn:schemas-microsoft-com:vml" xmlns:wp14="http://schemas.microsoft.com/office/word/2010/wordprocessingDrawing" xmlns:wp="http://schemas.openxmlformats.org/drawingml/2006/wordprocessingDrawing" xmlns:w10="urn:schemas-microsoft-com:office:word" xmlns:w="http://schemas.openxmlformats.org/wordprocessingml/2006/main" xmlns:w14="http://schemas.microsoft.com/office/word/2010/wordml" xmlns:w15="http://schemas.microsoft.com/office/word/2012/wordml" xmlns:w16cex="http://schemas.microsoft.com/office/word/2018/wordml/cex" xmlns:w16cid="http://schemas.microsoft.com/office/word/2016/wordml/cid" xmlns:w16="http://schemas.microsoft.com/office/word/2018/wordml" xmlns:w16du="http://schemas.microsoft.com/office/word/2023/wordml/word16du" xmlns:w16sdtdh="http://schemas.microsoft.com/office/word/2020/wordml/sdtdatahash" xmlns:w16sdtfl="http://schemas.microsoft.com/office/word/2024/wordml/sdtformatlock" xmlns:w16se="http://schemas.microsoft.com/office/word/2015/wordml/symex" xmlns:wpg="http://schemas.microsoft.com/office/word/2010/wordprocessingGroup" xmlns:wpi="http://schemas.microsoft.com/office/word/2010/wordprocessingInk" xmlns:wne="http://schemas.microsoft.com/office/word/2006/wordml" xmlns:wps="http://schemas.microsoft.com/office/word/2010/wordprocessingShape" mc:Ignorable="w14 w15 w16se w16cid w16 w16cex w16sdtdh w16sdtfl w16du wp14">
   <w:p>
     <w:pPr>
       <w:pBdr>
         <w:top w:val="single" w:sz="4" w:space="1" w:color="auto"/>
       </w:pBdr>
+      <w:jc w:val="right"/>
       <w:rPr>
         <w:b/>
         <w:bCs/>
@@ -6715,14 +8219,35 @@
         <w:bCs/>
       </w:rPr>
       <w:tab/>
-      <w:t xml:space="preserve">              v</w:t>
+      <w:t xml:space="preserve">             </w:t>
     </w:r>
     <w:r>
       <w:rPr>
         <w:b/>
         <w:bCs/>
       </w:rPr>
-      <w:t>edavms@gmail.com</w:t>
+      <w:t>www.</w:t>
+    </w:r>
+    <w:r>
+      <w:rPr>
+        <w:b/>
+        <w:bCs/>
+      </w:rPr>
+      <w:t>v</w:t>
+    </w:r>
+    <w:r>
+      <w:rPr>
+        <w:b/>
+        <w:bCs/>
+      </w:rPr>
+      <w:t>edavms</w:t>
+    </w:r>
+    <w:r>
+      <w:rPr>
+        <w:b/>
+        <w:bCs/>
+      </w:rPr>
+      <w:t>.in</w:t>
     </w:r>
     <w:r>
       <w:rPr>
@@ -6737,7 +8262,27 @@
         <w:bCs/>
       </w:rPr>
       <w:tab/>
+    </w:r>
+    <w:r>
+      <w:rPr>
+        <w:b/>
+        <w:bCs/>
+      </w:rPr>
+      <w:t xml:space="preserve">       </w:t>
+    </w:r>
+    <w:r>
+      <w:rPr>
+        <w:b/>
+        <w:bCs/>
+      </w:rPr>
       <w:t xml:space="preserve"> </w:t>
+    </w:r>
+    <w:r>
+      <w:rPr>
+        <w:b/>
+        <w:bCs/>
+      </w:rPr>
+      <w:t xml:space="preserve">    </w:t>
     </w:r>
     <w:r>
       <w:tab/>
@@ -6844,12 +8389,13 @@
 </file>
 
 <file path=word/footer2.xml><?xml version="1.0" encoding="utf-8"?>
-<w:ftr xmlns:wpc="http://schemas.microsoft.com/office/word/2010/wordprocessingCanvas" xmlns:cx="http://schemas.microsoft.com/office/drawing/2014/chartex" xmlns:cx1="http://schemas.microsoft.com/office/drawing/2015/9/8/chartex" xmlns:cx2="http://schemas.microsoft.com/office/drawing/2015/10/21/chartex" xmlns:cx3="http://schemas.microsoft.com/office/drawing/2016/5/9/chartex" xmlns:cx4="http://schemas.microsoft.com/office/drawing/2016/5/10/chartex" xmlns:cx5="http://schemas.microsoft.com/office/drawing/2016/5/11/chartex" xmlns:cx6="http://schemas.microsoft.com/office/drawing/2016/5/12/chartex" xmlns:cx7="http://schemas.microsoft.com/office/drawing/2016/5/13/chartex" xmlns:cx8="http://schemas.microsoft.com/office/drawing/2016/5/14/chartex" xmlns:mc="http://schemas.openxmlformats.org/markup-compatibility/2006" xmlns:aink="http://schemas.microsoft.com/office/drawing/2016/ink" xmlns:am3d="http://schemas.microsoft.com/office/drawing/2017/model3d" xmlns:o="urn:schemas-microsoft-com:office:office" xmlns:oel="http://schemas.microsoft.com/office/2019/extlst" xmlns:r="http://schemas.openxmlformats.org/officeDocument/2006/relationships" xmlns:m="http://schemas.openxmlformats.org/officeDocument/2006/math" xmlns:v="urn:schemas-microsoft-com:vml" xmlns:wp14="http://schemas.microsoft.com/office/word/2010/wordprocessingDrawing" xmlns:wp="http://schemas.openxmlformats.org/drawingml/2006/wordprocessingDrawing" xmlns:w10="urn:schemas-microsoft-com:office:word" xmlns:w="http://schemas.openxmlformats.org/wordprocessingml/2006/main" xmlns:w14="http://schemas.microsoft.com/office/word/2010/wordml" xmlns:w15="http://schemas.microsoft.com/office/word/2012/wordml" xmlns:w16cex="http://schemas.microsoft.com/office/word/2018/wordml/cex" xmlns:w16cid="http://schemas.microsoft.com/office/word/2016/wordml/cid" xmlns:w16="http://schemas.microsoft.com/office/word/2018/wordml" xmlns:w16sdtdh="http://schemas.microsoft.com/office/word/2020/wordml/sdtdatahash" xmlns:w16se="http://schemas.microsoft.com/office/word/2015/wordml/symex" xmlns:wpg="http://schemas.microsoft.com/office/word/2010/wordprocessingGroup" xmlns:wpi="http://schemas.microsoft.com/office/word/2010/wordprocessingInk" xmlns:wne="http://schemas.microsoft.com/office/word/2006/wordml" xmlns:wps="http://schemas.microsoft.com/office/word/2010/wordprocessingShape" mc:Ignorable="w14 w15 w16se w16cid w16 w16cex w16sdtdh wp14">
+<w:ftr xmlns:wpc="http://schemas.microsoft.com/office/word/2010/wordprocessingCanvas" xmlns:cx="http://schemas.microsoft.com/office/drawing/2014/chartex" xmlns:cx1="http://schemas.microsoft.com/office/drawing/2015/9/8/chartex" xmlns:cx2="http://schemas.microsoft.com/office/drawing/2015/10/21/chartex" xmlns:cx3="http://schemas.microsoft.com/office/drawing/2016/5/9/chartex" xmlns:cx4="http://schemas.microsoft.com/office/drawing/2016/5/10/chartex" xmlns:cx5="http://schemas.microsoft.com/office/drawing/2016/5/11/chartex" xmlns:cx6="http://schemas.microsoft.com/office/drawing/2016/5/12/chartex" xmlns:cx7="http://schemas.microsoft.com/office/drawing/2016/5/13/chartex" xmlns:cx8="http://schemas.microsoft.com/office/drawing/2016/5/14/chartex" xmlns:mc="http://schemas.openxmlformats.org/markup-compatibility/2006" xmlns:aink="http://schemas.microsoft.com/office/drawing/2016/ink" xmlns:am3d="http://schemas.microsoft.com/office/drawing/2017/model3d" xmlns:o="urn:schemas-microsoft-com:office:office" xmlns:oel="http://schemas.microsoft.com/office/2019/extlst" xmlns:r="http://schemas.openxmlformats.org/officeDocument/2006/relationships" xmlns:m="http://schemas.openxmlformats.org/officeDocument/2006/math" xmlns:v="urn:schemas-microsoft-com:vml" xmlns:wp14="http://schemas.microsoft.com/office/word/2010/wordprocessingDrawing" xmlns:wp="http://schemas.openxmlformats.org/drawingml/2006/wordprocessingDrawing" xmlns:w10="urn:schemas-microsoft-com:office:word" xmlns:w="http://schemas.openxmlformats.org/wordprocessingml/2006/main" xmlns:w14="http://schemas.microsoft.com/office/word/2010/wordml" xmlns:w15="http://schemas.microsoft.com/office/word/2012/wordml" xmlns:w16cex="http://schemas.microsoft.com/office/word/2018/wordml/cex" xmlns:w16cid="http://schemas.microsoft.com/office/word/2016/wordml/cid" xmlns:w16="http://schemas.microsoft.com/office/word/2018/wordml" xmlns:w16du="http://schemas.microsoft.com/office/word/2023/wordml/word16du" xmlns:w16sdtdh="http://schemas.microsoft.com/office/word/2020/wordml/sdtdatahash" xmlns:w16sdtfl="http://schemas.microsoft.com/office/word/2024/wordml/sdtformatlock" xmlns:w16se="http://schemas.microsoft.com/office/word/2015/wordml/symex" xmlns:wpg="http://schemas.microsoft.com/office/word/2010/wordprocessingGroup" xmlns:wpi="http://schemas.microsoft.com/office/word/2010/wordprocessingInk" xmlns:wne="http://schemas.microsoft.com/office/word/2006/wordml" xmlns:wps="http://schemas.microsoft.com/office/word/2010/wordprocessingShape" mc:Ignorable="w14 w15 w16se w16cid w16 w16cex w16sdtdh w16sdtfl w16du wp14">
   <w:p>
     <w:pPr>
       <w:pBdr>
         <w:top w:val="single" w:sz="4" w:space="1" w:color="auto"/>
       </w:pBdr>
+      <w:jc w:val="right"/>
       <w:rPr>
         <w:b/>
         <w:bCs/>
@@ -6931,6 +8477,19 @@
         <w:bCs/>
       </w:rPr>
       <w:tab/>
+    </w:r>
+    <w:r>
+      <w:rPr>
+        <w:b/>
+        <w:bCs/>
+      </w:rPr>
+      <w:t xml:space="preserve">           </w:t>
+    </w:r>
+    <w:r>
+      <w:rPr>
+        <w:b/>
+        <w:bCs/>
+      </w:rPr>
       <w:t xml:space="preserve"> </w:t>
     </w:r>
     <w:r>
@@ -7045,8 +8604,18 @@
 </w:ftr>
 </file>
 
+<file path=word/footer3.xml><?xml version="1.0" encoding="utf-8"?>
+<w:ftr xmlns:wpc="http://schemas.microsoft.com/office/word/2010/wordprocessingCanvas" xmlns:cx="http://schemas.microsoft.com/office/drawing/2014/chartex" xmlns:cx1="http://schemas.microsoft.com/office/drawing/2015/9/8/chartex" xmlns:cx2="http://schemas.microsoft.com/office/drawing/2015/10/21/chartex" xmlns:cx3="http://schemas.microsoft.com/office/drawing/2016/5/9/chartex" xmlns:cx4="http://schemas.microsoft.com/office/drawing/2016/5/10/chartex" xmlns:cx5="http://schemas.microsoft.com/office/drawing/2016/5/11/chartex" xmlns:cx6="http://schemas.microsoft.com/office/drawing/2016/5/12/chartex" xmlns:cx7="http://schemas.microsoft.com/office/drawing/2016/5/13/chartex" xmlns:cx8="http://schemas.microsoft.com/office/drawing/2016/5/14/chartex" xmlns:mc="http://schemas.openxmlformats.org/markup-compatibility/2006" xmlns:aink="http://schemas.microsoft.com/office/drawing/2016/ink" xmlns:am3d="http://schemas.microsoft.com/office/drawing/2017/model3d" xmlns:o="urn:schemas-microsoft-com:office:office" xmlns:oel="http://schemas.microsoft.com/office/2019/extlst" xmlns:r="http://schemas.openxmlformats.org/officeDocument/2006/relationships" xmlns:m="http://schemas.openxmlformats.org/officeDocument/2006/math" xmlns:v="urn:schemas-microsoft-com:vml" xmlns:wp14="http://schemas.microsoft.com/office/word/2010/wordprocessingDrawing" xmlns:wp="http://schemas.openxmlformats.org/drawingml/2006/wordprocessingDrawing" xmlns:w10="urn:schemas-microsoft-com:office:word" xmlns:w="http://schemas.openxmlformats.org/wordprocessingml/2006/main" xmlns:w14="http://schemas.microsoft.com/office/word/2010/wordml" xmlns:w15="http://schemas.microsoft.com/office/word/2012/wordml" xmlns:w16cex="http://schemas.microsoft.com/office/word/2018/wordml/cex" xmlns:w16cid="http://schemas.microsoft.com/office/word/2016/wordml/cid" xmlns:w16="http://schemas.microsoft.com/office/word/2018/wordml" xmlns:w16du="http://schemas.microsoft.com/office/word/2023/wordml/word16du" xmlns:w16sdtdh="http://schemas.microsoft.com/office/word/2020/wordml/sdtdatahash" xmlns:w16sdtfl="http://schemas.microsoft.com/office/word/2024/wordml/sdtformatlock" xmlns:w16se="http://schemas.microsoft.com/office/word/2015/wordml/symex" xmlns:wpg="http://schemas.microsoft.com/office/word/2010/wordprocessingGroup" xmlns:wpi="http://schemas.microsoft.com/office/word/2010/wordprocessingInk" xmlns:wne="http://schemas.microsoft.com/office/word/2006/wordml" xmlns:wps="http://schemas.microsoft.com/office/word/2010/wordprocessingShape" mc:Ignorable="w14 w15 w16se w16cid w16 w16cex w16sdtdh w16sdtfl w16du wp14">
+  <w:p>
+    <w:pPr>
+      <w:pStyle w:val="Footer"/>
+    </w:pPr>
+  </w:p>
+</w:ftr>
+</file>
+
 <file path=word/footnotes.xml><?xml version="1.0" encoding="utf-8"?>
-<w:footnotes xmlns:wpc="http://schemas.microsoft.com/office/word/2010/wordprocessingCanvas" xmlns:cx="http://schemas.microsoft.com/office/drawing/2014/chartex" xmlns:cx1="http://schemas.microsoft.com/office/drawing/2015/9/8/chartex" xmlns:cx2="http://schemas.microsoft.com/office/drawing/2015/10/21/chartex" xmlns:cx3="http://schemas.microsoft.com/office/drawing/2016/5/9/chartex" xmlns:cx4="http://schemas.microsoft.com/office/drawing/2016/5/10/chartex" xmlns:cx5="http://schemas.microsoft.com/office/drawing/2016/5/11/chartex" xmlns:cx6="http://schemas.microsoft.com/office/drawing/2016/5/12/chartex" xmlns:cx7="http://schemas.microsoft.com/office/drawing/2016/5/13/chartex" xmlns:cx8="http://schemas.microsoft.com/office/drawing/2016/5/14/chartex" xmlns:mc="http://schemas.openxmlformats.org/markup-compatibility/2006" xmlns:aink="http://schemas.microsoft.com/office/drawing/2016/ink" xmlns:am3d="http://schemas.microsoft.com/office/drawing/2017/model3d" xmlns:o="urn:schemas-microsoft-com:office:office" xmlns:oel="http://schemas.microsoft.com/office/2019/extlst" xmlns:r="http://schemas.openxmlformats.org/officeDocument/2006/relationships" xmlns:m="http://schemas.openxmlformats.org/officeDocument/2006/math" xmlns:v="urn:schemas-microsoft-com:vml" xmlns:wp14="http://schemas.microsoft.com/office/word/2010/wordprocessingDrawing" xmlns:wp="http://schemas.openxmlformats.org/drawingml/2006/wordprocessingDrawing" xmlns:w10="urn:schemas-microsoft-com:office:word" xmlns:w="http://schemas.openxmlformats.org/wordprocessingml/2006/main" xmlns:w14="http://schemas.microsoft.com/office/word/2010/wordml" xmlns:w15="http://schemas.microsoft.com/office/word/2012/wordml" xmlns:w16cex="http://schemas.microsoft.com/office/word/2018/wordml/cex" xmlns:w16cid="http://schemas.microsoft.com/office/word/2016/wordml/cid" xmlns:w16="http://schemas.microsoft.com/office/word/2018/wordml" xmlns:w16sdtdh="http://schemas.microsoft.com/office/word/2020/wordml/sdtdatahash" xmlns:w16se="http://schemas.microsoft.com/office/word/2015/wordml/symex" xmlns:wpg="http://schemas.microsoft.com/office/word/2010/wordprocessingGroup" xmlns:wpi="http://schemas.microsoft.com/office/word/2010/wordprocessingInk" xmlns:wne="http://schemas.microsoft.com/office/word/2006/wordml" xmlns:wps="http://schemas.microsoft.com/office/word/2010/wordprocessingShape" mc:Ignorable="w14 w15 w16se w16cid w16 w16cex w16sdtdh wp14">
+<w:footnotes xmlns:wpc="http://schemas.microsoft.com/office/word/2010/wordprocessingCanvas" xmlns:cx="http://schemas.microsoft.com/office/drawing/2014/chartex" xmlns:cx1="http://schemas.microsoft.com/office/drawing/2015/9/8/chartex" xmlns:cx2="http://schemas.microsoft.com/office/drawing/2015/10/21/chartex" xmlns:cx3="http://schemas.microsoft.com/office/drawing/2016/5/9/chartex" xmlns:cx4="http://schemas.microsoft.com/office/drawing/2016/5/10/chartex" xmlns:cx5="http://schemas.microsoft.com/office/drawing/2016/5/11/chartex" xmlns:cx6="http://schemas.microsoft.com/office/drawing/2016/5/12/chartex" xmlns:cx7="http://schemas.microsoft.com/office/drawing/2016/5/13/chartex" xmlns:cx8="http://schemas.microsoft.com/office/drawing/2016/5/14/chartex" xmlns:mc="http://schemas.openxmlformats.org/markup-compatibility/2006" xmlns:aink="http://schemas.microsoft.com/office/drawing/2016/ink" xmlns:am3d="http://schemas.microsoft.com/office/drawing/2017/model3d" xmlns:o="urn:schemas-microsoft-com:office:office" xmlns:oel="http://schemas.microsoft.com/office/2019/extlst" xmlns:r="http://schemas.openxmlformats.org/officeDocument/2006/relationships" xmlns:m="http://schemas.openxmlformats.org/officeDocument/2006/math" xmlns:v="urn:schemas-microsoft-com:vml" xmlns:wp14="http://schemas.microsoft.com/office/word/2010/wordprocessingDrawing" xmlns:wp="http://schemas.openxmlformats.org/drawingml/2006/wordprocessingDrawing" xmlns:w10="urn:schemas-microsoft-com:office:word" xmlns:w="http://schemas.openxmlformats.org/wordprocessingml/2006/main" xmlns:w14="http://schemas.microsoft.com/office/word/2010/wordml" xmlns:w15="http://schemas.microsoft.com/office/word/2012/wordml" xmlns:w16cex="http://schemas.microsoft.com/office/word/2018/wordml/cex" xmlns:w16cid="http://schemas.microsoft.com/office/word/2016/wordml/cid" xmlns:w16="http://schemas.microsoft.com/office/word/2018/wordml" xmlns:w16du="http://schemas.microsoft.com/office/word/2023/wordml/word16du" xmlns:w16sdtdh="http://schemas.microsoft.com/office/word/2020/wordml/sdtdatahash" xmlns:w16sdtfl="http://schemas.microsoft.com/office/word/2024/wordml/sdtformatlock" xmlns:w16se="http://schemas.microsoft.com/office/word/2015/wordml/symex" xmlns:wpg="http://schemas.microsoft.com/office/word/2010/wordprocessingGroup" xmlns:wpi="http://schemas.microsoft.com/office/word/2010/wordprocessingInk" xmlns:wne="http://schemas.microsoft.com/office/word/2006/wordml" xmlns:wps="http://schemas.microsoft.com/office/word/2010/wordprocessingShape" mc:Ignorable="w14 w15 w16se w16cid w16 w16cex w16sdtdh w16sdtfl w16du wp14">
   <w:footnote w:type="separator" w:id="-1">
     <w:p>
       <w:pPr>
@@ -7071,7 +8640,7 @@
 </file>
 
 <file path=word/header1.xml><?xml version="1.0" encoding="utf-8"?>
-<w:hdr xmlns:wpc="http://schemas.microsoft.com/office/word/2010/wordprocessingCanvas" xmlns:cx="http://schemas.microsoft.com/office/drawing/2014/chartex" xmlns:cx1="http://schemas.microsoft.com/office/drawing/2015/9/8/chartex" xmlns:cx2="http://schemas.microsoft.com/office/drawing/2015/10/21/chartex" xmlns:cx3="http://schemas.microsoft.com/office/drawing/2016/5/9/chartex" xmlns:cx4="http://schemas.microsoft.com/office/drawing/2016/5/10/chartex" xmlns:cx5="http://schemas.microsoft.com/office/drawing/2016/5/11/chartex" xmlns:cx6="http://schemas.microsoft.com/office/drawing/2016/5/12/chartex" xmlns:cx7="http://schemas.microsoft.com/office/drawing/2016/5/13/chartex" xmlns:cx8="http://schemas.microsoft.com/office/drawing/2016/5/14/chartex" xmlns:mc="http://schemas.openxmlformats.org/markup-compatibility/2006" xmlns:aink="http://schemas.microsoft.com/office/drawing/2016/ink" xmlns:am3d="http://schemas.microsoft.com/office/drawing/2017/model3d" xmlns:o="urn:schemas-microsoft-com:office:office" xmlns:oel="http://schemas.microsoft.com/office/2019/extlst" xmlns:r="http://schemas.openxmlformats.org/officeDocument/2006/relationships" xmlns:m="http://schemas.openxmlformats.org/officeDocument/2006/math" xmlns:v="urn:schemas-microsoft-com:vml" xmlns:wp14="http://schemas.microsoft.com/office/word/2010/wordprocessingDrawing" xmlns:wp="http://schemas.openxmlformats.org/drawingml/2006/wordprocessingDrawing" xmlns:w10="urn:schemas-microsoft-com:office:word" xmlns:w="http://schemas.openxmlformats.org/wordprocessingml/2006/main" xmlns:w14="http://schemas.microsoft.com/office/word/2010/wordml" xmlns:w15="http://schemas.microsoft.com/office/word/2012/wordml" xmlns:w16cex="http://schemas.microsoft.com/office/word/2018/wordml/cex" xmlns:w16cid="http://schemas.microsoft.com/office/word/2016/wordml/cid" xmlns:w16="http://schemas.microsoft.com/office/word/2018/wordml" xmlns:w16sdtdh="http://schemas.microsoft.com/office/word/2020/wordml/sdtdatahash" xmlns:w16se="http://schemas.microsoft.com/office/word/2015/wordml/symex" xmlns:wpg="http://schemas.microsoft.com/office/word/2010/wordprocessingGroup" xmlns:wpi="http://schemas.microsoft.com/office/word/2010/wordprocessingInk" xmlns:wne="http://schemas.microsoft.com/office/word/2006/wordml" xmlns:wps="http://schemas.microsoft.com/office/word/2010/wordprocessingShape" mc:Ignorable="w14 w15 w16se w16cid w16 w16cex w16sdtdh wp14">
+<w:hdr xmlns:wpc="http://schemas.microsoft.com/office/word/2010/wordprocessingCanvas" xmlns:cx="http://schemas.microsoft.com/office/drawing/2014/chartex" xmlns:cx1="http://schemas.microsoft.com/office/drawing/2015/9/8/chartex" xmlns:cx2="http://schemas.microsoft.com/office/drawing/2015/10/21/chartex" xmlns:cx3="http://schemas.microsoft.com/office/drawing/2016/5/9/chartex" xmlns:cx4="http://schemas.microsoft.com/office/drawing/2016/5/10/chartex" xmlns:cx5="http://schemas.microsoft.com/office/drawing/2016/5/11/chartex" xmlns:cx6="http://schemas.microsoft.com/office/drawing/2016/5/12/chartex" xmlns:cx7="http://schemas.microsoft.com/office/drawing/2016/5/13/chartex" xmlns:cx8="http://schemas.microsoft.com/office/drawing/2016/5/14/chartex" xmlns:mc="http://schemas.openxmlformats.org/markup-compatibility/2006" xmlns:aink="http://schemas.microsoft.com/office/drawing/2016/ink" xmlns:am3d="http://schemas.microsoft.com/office/drawing/2017/model3d" xmlns:o="urn:schemas-microsoft-com:office:office" xmlns:oel="http://schemas.microsoft.com/office/2019/extlst" xmlns:r="http://schemas.openxmlformats.org/officeDocument/2006/relationships" xmlns:m="http://schemas.openxmlformats.org/officeDocument/2006/math" xmlns:v="urn:schemas-microsoft-com:vml" xmlns:wp14="http://schemas.microsoft.com/office/word/2010/wordprocessingDrawing" xmlns:wp="http://schemas.openxmlformats.org/drawingml/2006/wordprocessingDrawing" xmlns:w10="urn:schemas-microsoft-com:office:word" xmlns:w="http://schemas.openxmlformats.org/wordprocessingml/2006/main" xmlns:w14="http://schemas.microsoft.com/office/word/2010/wordml" xmlns:w15="http://schemas.microsoft.com/office/word/2012/wordml" xmlns:w16cex="http://schemas.microsoft.com/office/word/2018/wordml/cex" xmlns:w16cid="http://schemas.microsoft.com/office/word/2016/wordml/cid" xmlns:w16="http://schemas.microsoft.com/office/word/2018/wordml" xmlns:w16du="http://schemas.microsoft.com/office/word/2023/wordml/word16du" xmlns:w16sdtdh="http://schemas.microsoft.com/office/word/2020/wordml/sdtdatahash" xmlns:w16sdtfl="http://schemas.microsoft.com/office/word/2024/wordml/sdtformatlock" xmlns:w16se="http://schemas.microsoft.com/office/word/2015/wordml/symex" xmlns:wpg="http://schemas.microsoft.com/office/word/2010/wordprocessingGroup" xmlns:wpi="http://schemas.microsoft.com/office/word/2010/wordprocessingInk" xmlns:wne="http://schemas.microsoft.com/office/word/2006/wordml" xmlns:wps="http://schemas.microsoft.com/office/word/2010/wordprocessingShape" mc:Ignorable="w14 w15 w16se w16cid w16 w16cex w16sdtdh w16sdtfl w16du wp14">
   <w:p>
     <w:pPr>
       <w:pStyle w:val="Header"/>
@@ -7084,7 +8653,7 @@
 </file>
 
 <file path=word/header2.xml><?xml version="1.0" encoding="utf-8"?>
-<w:hdr xmlns:wpc="http://schemas.microsoft.com/office/word/2010/wordprocessingCanvas" xmlns:cx="http://schemas.microsoft.com/office/drawing/2014/chartex" xmlns:cx1="http://schemas.microsoft.com/office/drawing/2015/9/8/chartex" xmlns:cx2="http://schemas.microsoft.com/office/drawing/2015/10/21/chartex" xmlns:cx3="http://schemas.microsoft.com/office/drawing/2016/5/9/chartex" xmlns:cx4="http://schemas.microsoft.com/office/drawing/2016/5/10/chartex" xmlns:cx5="http://schemas.microsoft.com/office/drawing/2016/5/11/chartex" xmlns:cx6="http://schemas.microsoft.com/office/drawing/2016/5/12/chartex" xmlns:cx7="http://schemas.microsoft.com/office/drawing/2016/5/13/chartex" xmlns:cx8="http://schemas.microsoft.com/office/drawing/2016/5/14/chartex" xmlns:mc="http://schemas.openxmlformats.org/markup-compatibility/2006" xmlns:aink="http://schemas.microsoft.com/office/drawing/2016/ink" xmlns:am3d="http://schemas.microsoft.com/office/drawing/2017/model3d" xmlns:o="urn:schemas-microsoft-com:office:office" xmlns:oel="http://schemas.microsoft.com/office/2019/extlst" xmlns:r="http://schemas.openxmlformats.org/officeDocument/2006/relationships" xmlns:m="http://schemas.openxmlformats.org/officeDocument/2006/math" xmlns:v="urn:schemas-microsoft-com:vml" xmlns:wp14="http://schemas.microsoft.com/office/word/2010/wordprocessingDrawing" xmlns:wp="http://schemas.openxmlformats.org/drawingml/2006/wordprocessingDrawing" xmlns:w10="urn:schemas-microsoft-com:office:word" xmlns:w="http://schemas.openxmlformats.org/wordprocessingml/2006/main" xmlns:w14="http://schemas.microsoft.com/office/word/2010/wordml" xmlns:w15="http://schemas.microsoft.com/office/word/2012/wordml" xmlns:w16cex="http://schemas.microsoft.com/office/word/2018/wordml/cex" xmlns:w16cid="http://schemas.microsoft.com/office/word/2016/wordml/cid" xmlns:w16="http://schemas.microsoft.com/office/word/2018/wordml" xmlns:w16sdtdh="http://schemas.microsoft.com/office/word/2020/wordml/sdtdatahash" xmlns:w16se="http://schemas.microsoft.com/office/word/2015/wordml/symex" xmlns:wpg="http://schemas.microsoft.com/office/word/2010/wordprocessingGroup" xmlns:wpi="http://schemas.microsoft.com/office/word/2010/wordprocessingInk" xmlns:wne="http://schemas.microsoft.com/office/word/2006/wordml" xmlns:wps="http://schemas.microsoft.com/office/word/2010/wordprocessingShape" mc:Ignorable="w14 w15 w16se w16cid w16 w16cex w16sdtdh wp14">
+<w:hdr xmlns:wpc="http://schemas.microsoft.com/office/word/2010/wordprocessingCanvas" xmlns:cx="http://schemas.microsoft.com/office/drawing/2014/chartex" xmlns:cx1="http://schemas.microsoft.com/office/drawing/2015/9/8/chartex" xmlns:cx2="http://schemas.microsoft.com/office/drawing/2015/10/21/chartex" xmlns:cx3="http://schemas.microsoft.com/office/drawing/2016/5/9/chartex" xmlns:cx4="http://schemas.microsoft.com/office/drawing/2016/5/10/chartex" xmlns:cx5="http://schemas.microsoft.com/office/drawing/2016/5/11/chartex" xmlns:cx6="http://schemas.microsoft.com/office/drawing/2016/5/12/chartex" xmlns:cx7="http://schemas.microsoft.com/office/drawing/2016/5/13/chartex" xmlns:cx8="http://schemas.microsoft.com/office/drawing/2016/5/14/chartex" xmlns:mc="http://schemas.openxmlformats.org/markup-compatibility/2006" xmlns:aink="http://schemas.microsoft.com/office/drawing/2016/ink" xmlns:am3d="http://schemas.microsoft.com/office/drawing/2017/model3d" xmlns:o="urn:schemas-microsoft-com:office:office" xmlns:oel="http://schemas.microsoft.com/office/2019/extlst" xmlns:r="http://schemas.openxmlformats.org/officeDocument/2006/relationships" xmlns:m="http://schemas.openxmlformats.org/officeDocument/2006/math" xmlns:v="urn:schemas-microsoft-com:vml" xmlns:wp14="http://schemas.microsoft.com/office/word/2010/wordprocessingDrawing" xmlns:wp="http://schemas.openxmlformats.org/drawingml/2006/wordprocessingDrawing" xmlns:w10="urn:schemas-microsoft-com:office:word" xmlns:w="http://schemas.openxmlformats.org/wordprocessingml/2006/main" xmlns:w14="http://schemas.microsoft.com/office/word/2010/wordml" xmlns:w15="http://schemas.microsoft.com/office/word/2012/wordml" xmlns:w16cex="http://schemas.microsoft.com/office/word/2018/wordml/cex" xmlns:w16cid="http://schemas.microsoft.com/office/word/2016/wordml/cid" xmlns:w16="http://schemas.microsoft.com/office/word/2018/wordml" xmlns:w16du="http://schemas.microsoft.com/office/word/2023/wordml/word16du" xmlns:w16sdtdh="http://schemas.microsoft.com/office/word/2020/wordml/sdtdatahash" xmlns:w16sdtfl="http://schemas.microsoft.com/office/word/2024/wordml/sdtformatlock" xmlns:w16se="http://schemas.microsoft.com/office/word/2015/wordml/symex" xmlns:wpg="http://schemas.microsoft.com/office/word/2010/wordprocessingGroup" xmlns:wpi="http://schemas.microsoft.com/office/word/2010/wordprocessingInk" xmlns:wne="http://schemas.microsoft.com/office/word/2006/wordml" xmlns:wps="http://schemas.microsoft.com/office/word/2010/wordprocessingShape" mc:Ignorable="w14 w15 w16se w16cid w16 w16cex w16sdtdh w16sdtfl w16du wp14">
   <w:p>
     <w:pPr>
       <w:pStyle w:val="Header"/>
@@ -7096,8 +8665,18 @@
 </w:hdr>
 </file>
 
+<file path=word/header3.xml><?xml version="1.0" encoding="utf-8"?>
+<w:hdr xmlns:wpc="http://schemas.microsoft.com/office/word/2010/wordprocessingCanvas" xmlns:cx="http://schemas.microsoft.com/office/drawing/2014/chartex" xmlns:cx1="http://schemas.microsoft.com/office/drawing/2015/9/8/chartex" xmlns:cx2="http://schemas.microsoft.com/office/drawing/2015/10/21/chartex" xmlns:cx3="http://schemas.microsoft.com/office/drawing/2016/5/9/chartex" xmlns:cx4="http://schemas.microsoft.com/office/drawing/2016/5/10/chartex" xmlns:cx5="http://schemas.microsoft.com/office/drawing/2016/5/11/chartex" xmlns:cx6="http://schemas.microsoft.com/office/drawing/2016/5/12/chartex" xmlns:cx7="http://schemas.microsoft.com/office/drawing/2016/5/13/chartex" xmlns:cx8="http://schemas.microsoft.com/office/drawing/2016/5/14/chartex" xmlns:mc="http://schemas.openxmlformats.org/markup-compatibility/2006" xmlns:aink="http://schemas.microsoft.com/office/drawing/2016/ink" xmlns:am3d="http://schemas.microsoft.com/office/drawing/2017/model3d" xmlns:o="urn:schemas-microsoft-com:office:office" xmlns:oel="http://schemas.microsoft.com/office/2019/extlst" xmlns:r="http://schemas.openxmlformats.org/officeDocument/2006/relationships" xmlns:m="http://schemas.openxmlformats.org/officeDocument/2006/math" xmlns:v="urn:schemas-microsoft-com:vml" xmlns:wp14="http://schemas.microsoft.com/office/word/2010/wordprocessingDrawing" xmlns:wp="http://schemas.openxmlformats.org/drawingml/2006/wordprocessingDrawing" xmlns:w10="urn:schemas-microsoft-com:office:word" xmlns:w="http://schemas.openxmlformats.org/wordprocessingml/2006/main" xmlns:w14="http://schemas.microsoft.com/office/word/2010/wordml" xmlns:w15="http://schemas.microsoft.com/office/word/2012/wordml" xmlns:w16cex="http://schemas.microsoft.com/office/word/2018/wordml/cex" xmlns:w16cid="http://schemas.microsoft.com/office/word/2016/wordml/cid" xmlns:w16="http://schemas.microsoft.com/office/word/2018/wordml" xmlns:w16du="http://schemas.microsoft.com/office/word/2023/wordml/word16du" xmlns:w16sdtdh="http://schemas.microsoft.com/office/word/2020/wordml/sdtdatahash" xmlns:w16sdtfl="http://schemas.microsoft.com/office/word/2024/wordml/sdtformatlock" xmlns:w16se="http://schemas.microsoft.com/office/word/2015/wordml/symex" xmlns:wpg="http://schemas.microsoft.com/office/word/2010/wordprocessingGroup" xmlns:wpi="http://schemas.microsoft.com/office/word/2010/wordprocessingInk" xmlns:wne="http://schemas.microsoft.com/office/word/2006/wordml" xmlns:wps="http://schemas.microsoft.com/office/word/2010/wordprocessingShape" mc:Ignorable="w14 w15 w16se w16cid w16 w16cex w16sdtdh w16sdtfl w16du wp14">
+  <w:p>
+    <w:pPr>
+      <w:pStyle w:val="Header"/>
+    </w:pPr>
+  </w:p>
+</w:hdr>
+</file>
+
 <file path=word/styles.xml><?xml version="1.0" encoding="utf-8"?>
-<w:styles xmlns:mc="http://schemas.openxmlformats.org/markup-compatibility/2006" xmlns:r="http://schemas.openxmlformats.org/officeDocument/2006/relationships" xmlns:w="http://schemas.openxmlformats.org/wordprocessingml/2006/main" xmlns:w14="http://schemas.microsoft.com/office/word/2010/wordml" xmlns:w15="http://schemas.microsoft.com/office/word/2012/wordml" xmlns:w16cex="http://schemas.microsoft.com/office/word/2018/wordml/cex" xmlns:w16cid="http://schemas.microsoft.com/office/word/2016/wordml/cid" xmlns:w16="http://schemas.microsoft.com/office/word/2018/wordml" xmlns:w16sdtdh="http://schemas.microsoft.com/office/word/2020/wordml/sdtdatahash" xmlns:w16se="http://schemas.microsoft.com/office/word/2015/wordml/symex" mc:Ignorable="w14 w15 w16se w16cid w16 w16cex w16sdtdh">
+<w:styles xmlns:mc="http://schemas.openxmlformats.org/markup-compatibility/2006" xmlns:r="http://schemas.openxmlformats.org/officeDocument/2006/relationships" xmlns:w="http://schemas.openxmlformats.org/wordprocessingml/2006/main" xmlns:w14="http://schemas.microsoft.com/office/word/2010/wordml" xmlns:w15="http://schemas.microsoft.com/office/word/2012/wordml" xmlns:w16cex="http://schemas.microsoft.com/office/word/2018/wordml/cex" xmlns:w16cid="http://schemas.microsoft.com/office/word/2016/wordml/cid" xmlns:w16="http://schemas.microsoft.com/office/word/2018/wordml" xmlns:w16du="http://schemas.microsoft.com/office/word/2023/wordml/word16du" xmlns:w16sdtdh="http://schemas.microsoft.com/office/word/2020/wordml/sdtdatahash" xmlns:w16sdtfl="http://schemas.microsoft.com/office/word/2024/wordml/sdtformatlock" xmlns:w16se="http://schemas.microsoft.com/office/word/2015/wordml/symex" mc:Ignorable="w14 w15 w16se w16cid w16 w16cex w16sdtdh w16sdtfl w16du">
   <w:docDefaults>
     <w:rPrDefault>
       <w:rPr>

</xml_diff>

<commit_message>
TS 3.1 to 3.5 Kramam final, 7.1 TS , TS 6 Kramam compare
</commit_message>
<xml_diff>
--- a/TS-Kramam/TS-3.1/TS 3.1 Tamil Krama Paatam Corrections.docx
+++ b/TS-Kramam/TS-3.1/TS 3.1 Tamil Krama Paatam Corrections.docx
@@ -8,9 +8,6 @@
         <w:rPr>
           <w:b/>
           <w:bCs/>
-          <w:sz w:val="32"/>
-          <w:szCs w:val="32"/>
-          <w:u w:val="single"/>
         </w:rPr>
       </w:pPr>
       <w:r>
@@ -69,20 +66,24 @@
           <w:bCs/>
           <w:sz w:val="32"/>
           <w:szCs w:val="32"/>
-          <w:highlight w:val="red"/>
           <w:u w:val="single"/>
         </w:rPr>
-        <w:t>?????</w:t>
+        <w:t>31st August 2026</w:t>
       </w:r>
-    </w:p>
-    <w:p>
-      <w:pPr>
-        <w:jc w:val="center"/>
+      <w:r>
         <w:rPr>
           <w:b/>
           <w:bCs/>
         </w:rPr>
-      </w:pPr>
+        <w:t xml:space="preserve"> </w:t>
+      </w:r>
+      <w:r>
+        <w:rPr>
+          <w:b/>
+          <w:bCs/>
+        </w:rPr>
+        <w:br/>
+      </w:r>
       <w:r>
         <w:rPr>
           <w:b/>
@@ -2705,6 +2706,9 @@
     </w:tbl>
     <w:p>
       <w:pPr>
+        <w:pBdr>
+          <w:bottom w:val="double" w:sz="6" w:space="1" w:color="auto"/>
+        </w:pBdr>
         <w:jc w:val="center"/>
         <w:rPr>
           <w:b/>
@@ -2714,7 +2718,10 @@
           <w:u w:val="single"/>
         </w:rPr>
       </w:pPr>
-      <w:r>
+    </w:p>
+    <w:p>
+      <w:pPr>
+        <w:jc w:val="center"/>
         <w:rPr>
           <w:b/>
           <w:bCs/>
@@ -2722,8 +2729,31 @@
           <w:szCs w:val="32"/>
           <w:u w:val="single"/>
         </w:rPr>
-        <w:t>==========</w:t>
-      </w:r>
+      </w:pPr>
+    </w:p>
+    <w:p>
+      <w:pPr>
+        <w:jc w:val="center"/>
+        <w:rPr>
+          <w:b/>
+          <w:bCs/>
+          <w:sz w:val="32"/>
+          <w:szCs w:val="32"/>
+          <w:u w:val="single"/>
+        </w:rPr>
+      </w:pPr>
+    </w:p>
+    <w:p>
+      <w:pPr>
+        <w:jc w:val="center"/>
+        <w:rPr>
+          <w:b/>
+          <w:bCs/>
+          <w:sz w:val="32"/>
+          <w:szCs w:val="32"/>
+          <w:u w:val="single"/>
+        </w:rPr>
+      </w:pPr>
     </w:p>
     <w:p>
       <w:pPr>
@@ -2744,6 +2774,7 @@
           <w:szCs w:val="32"/>
           <w:u w:val="single"/>
         </w:rPr>
+        <w:lastRenderedPageBreak/>
         <w:t xml:space="preserve">TS </w:t>
       </w:r>
       <w:r>
@@ -2897,7 +2928,6 @@
                 <w:sz w:val="32"/>
                 <w:szCs w:val="32"/>
               </w:rPr>
-              <w:lastRenderedPageBreak/>
               <w:t>Reference</w:t>
             </w:r>
           </w:p>
@@ -2924,7 +2954,6 @@
                 <w:sz w:val="32"/>
                 <w:szCs w:val="32"/>
               </w:rPr>
-              <w:lastRenderedPageBreak/>
               <w:t>As Printed</w:t>
             </w:r>
           </w:p>
@@ -5402,6 +5431,7 @@
                 <w:sz w:val="28"/>
                 <w:szCs w:val="32"/>
               </w:rPr>
+              <w:lastRenderedPageBreak/>
               <w:t>T.S.</w:t>
             </w:r>
             <w:r>
@@ -6176,12 +6206,21 @@
               </w:rPr>
               <w:t xml:space="preserve"> </w:t>
             </w:r>
+            <w:proofErr w:type="spellStart"/>
             <w:r>
               <w:rPr>
                 <w:b/>
                 <w:bCs/>
               </w:rPr>
-              <w:t>deergham)</w:t>
+              <w:t>deergham</w:t>
+            </w:r>
+            <w:proofErr w:type="spellEnd"/>
+            <w:r>
+              <w:rPr>
+                <w:b/>
+                <w:bCs/>
+              </w:rPr>
+              <w:t>)</w:t>
             </w:r>
           </w:p>
         </w:tc>
@@ -6221,7 +6260,6 @@
                 <w:sz w:val="28"/>
                 <w:szCs w:val="32"/>
               </w:rPr>
-              <w:lastRenderedPageBreak/>
               <w:t>T.S.</w:t>
             </w:r>
             <w:r>
@@ -8836,7 +8874,29 @@
           <w:szCs w:val="40"/>
           <w:lang w:val="en-IN" w:eastAsia="en-IN"/>
         </w:rPr>
-        <w:t xml:space="preserve">"zlÉ" </w:t>
+        <w:t>"</w:t>
+      </w:r>
+      <w:proofErr w:type="spellStart"/>
+      <w:r>
+        <w:rPr>
+          <w:rFonts w:ascii="BRH Devanagari" w:hAnsi="BRH Devanagari" w:cs="BRH Devanagari"/>
+          <w:color w:val="000000"/>
+          <w:sz w:val="40"/>
+          <w:szCs w:val="40"/>
+          <w:lang w:val="en-IN" w:eastAsia="en-IN"/>
+        </w:rPr>
+        <w:t>zlÉ</w:t>
+      </w:r>
+      <w:proofErr w:type="spellEnd"/>
+      <w:r>
+        <w:rPr>
+          <w:rFonts w:ascii="BRH Devanagari" w:hAnsi="BRH Devanagari" w:cs="BRH Devanagari"/>
+          <w:color w:val="000000"/>
+          <w:sz w:val="40"/>
+          <w:szCs w:val="40"/>
+          <w:lang w:val="en-IN" w:eastAsia="en-IN"/>
+        </w:rPr>
+        <w:t xml:space="preserve">" </w:t>
       </w:r>
       <w:r>
         <w:rPr>
@@ -8844,7 +8904,16 @@
           <w:bCs/>
           <w:sz w:val="32"/>
         </w:rPr>
-        <w:t>replaced with</w:t>
+        <w:t xml:space="preserve">replaced </w:t>
+      </w:r>
+      <w:proofErr w:type="gramStart"/>
+      <w:r>
+        <w:rPr>
+          <w:b/>
+          <w:bCs/>
+          <w:sz w:val="32"/>
+        </w:rPr>
+        <w:t>with</w:t>
       </w:r>
       <w:r>
         <w:rPr>
@@ -8866,6 +8935,8 @@
         </w:rPr>
         <w:t>"</w:t>
       </w:r>
+      <w:proofErr w:type="spellStart"/>
+      <w:proofErr w:type="gramEnd"/>
       <w:r>
         <w:rPr>
           <w:rFonts w:ascii="BRH Devanagari" w:hAnsi="BRH Devanagari" w:cs="BRH Devanagari"/>
@@ -8877,6 +8948,7 @@
         </w:rPr>
         <w:t>zgÉ</w:t>
       </w:r>
+      <w:proofErr w:type="spellEnd"/>
       <w:r>
         <w:rPr>
           <w:rFonts w:ascii="BRH Devanagari" w:hAnsi="BRH Devanagari" w:cs="BRH Devanagari"/>
@@ -8938,6 +9010,7 @@
           <w:szCs w:val="32"/>
           <w:u w:val="single"/>
         </w:rPr>
+        <w:lastRenderedPageBreak/>
         <w:t xml:space="preserve">TS </w:t>
       </w:r>
       <w:r>
@@ -9090,7 +9163,6 @@
                 <w:sz w:val="32"/>
                 <w:szCs w:val="32"/>
               </w:rPr>
-              <w:lastRenderedPageBreak/>
               <w:t>Reference</w:t>
             </w:r>
           </w:p>
@@ -9117,7 +9189,6 @@
                 <w:sz w:val="32"/>
                 <w:szCs w:val="32"/>
               </w:rPr>
-              <w:lastRenderedPageBreak/>
               <w:t>As Printed</w:t>
             </w:r>
           </w:p>

</xml_diff>